<commit_message>
Final report with pipeline and architecture diagrams
</commit_message>
<xml_diff>
--- a/paper/Project_Report_Final.docx
+++ b/paper/Project_Report_Final.docx
@@ -59,7 +59,7 @@
         <w:rPr>
           <w:b w:val="0"/>
         </w:rPr>
-        <w:t>Exhaustive beam training over 256 receive beams creates significant overhead and latency in high-mobility 60 GHz Vehicle-to-Vehicle (V2V) millimeter-wave communications. Existing approaches predict the single best beam or a static calibrated subset, but none predict the complete future beam-power landscape while adapting the candidate-set threshold online as vehicle trajectories evolve. This work proposes P3, a multi-task deep learning model that jointly predicts a 256-class beam classification head and a 256-value power-gap profile head from five synchronized historical RGB frames and GPS measurements, using a ResNet-18 visual encoder, a Bidirectional GRU GPS encoder, and a Pre-Layer-Normalization Transformer fusion module. The predicted profile feeds an Adaptive Conformal Inference (ACI) online risk controller maintaining a near-optimal-beam miss rate target adaptively during deployment. Evaluated on DeepSense 6G Scenario 36 (24,799 V2V samples, US testbed), P3 achieves profile MAE 2.49 dB — below the theoretical mean-profile floor of 3.11 dB — and Top-5 accuracy 46.8% (3.1x the GPS-only baseline). The ACI controller maintains 7.5% miss rate at only 17 average probes (93% search reduction). A paired trajectory-block bootstrap confirms P3 significantly outperforms the classification-only baseline (+6.35%, 95% CI: [+1.38%, +8.18%]).</w:t>
+        <w:t>Exhaustive beam training over 256 receive beams creates significant overhead and latency in high-mobility 60 GHz Vehicle-to-Vehicle (V2V) millimeter-wave communications. Existing approaches predict the single best beam or a static calibrated subset, but none predict the complete future beam-power landscape while adapting the candidate-set threshold online as vehicle trajectories evolve. This work proposes P3, a multi-task deep learning model that jointly predicts a 256-class beam classification head and a 256-value power-gap profile head from five synchronized historical RGB frames and GPS measurements, using a ResNet-18 visual encoder, a Bidirectional GRU GPS encoder, and a Pre-Layer-Normalization Transformer fusion module. The predicted profile feeds an Adaptive Conformal Inference (ACI) online risk controller that maintains a near-optimal-beam miss rate target adaptively during deployment. Evaluated on DeepSense 6G Scenario 36 (24,799 V2V samples), P3 achieves profile MAE 2.49 dB — below the mean-profile floor of 3.11 dB — and Top-5 accuracy 46.8% (3.1x GPS-only baseline). The ACI controller achieves 7.5% miss rate at 17 average probes (93% search reduction). A paired trajectory-block bootstrap confirms P3 significantly outperforms the classification-only baseline (+6.35%, 95% CI: [+1.38%, +8.18%]).</w:t>
       </w:r>
     </w:p>
     <w:p/>
@@ -77,7 +77,7 @@
         <w:rPr>
           <w:b w:val="0"/>
         </w:rPr>
-        <w:t>The deployment of 5G and emerging 6G networks increasingly relies on millimeter-wave frequencies to deliver high data rates for applications such as autonomous vehicles, augmented reality, and dense urban broadband. In V2V mmWave communication at 60 GHz, highly directional antenna arrays with hundreds of beams must be periodically aligned between transmitter and receiver. The standard approach — exhaustive beam sweeping over all 256 beams — introduces unacceptable overhead and latency in high-mobility scenarios where the optimal beam changes rapidly as vehicles move.</w:t>
+        <w:t>The deployment of 5G and emerging 6G networks increasingly relies on millimeter-wave (mmWave) frequencies to deliver high data rates for autonomous vehicles, augmented reality, and dense urban broadband. In V2V mmWave communication at 60 GHz, highly directional antenna arrays with hundreds of beams must be periodically aligned between transmitter and receiver. The standard approach — exhaustive beam sweeping over all 256 beams — introduces unacceptable overhead and latency in high-mobility scenarios.</w:t>
       </w:r>
     </w:p>
     <w:p>
@@ -85,7 +85,7 @@
         <w:rPr>
           <w:b w:val="0"/>
         </w:rPr>
-        <w:t>The core problem addressed: given five historical synchronized RGB camera frames and GPS positions from both vehicles, can we accurately predict the full future 256-beam receive-power landscape and construct a small candidate set guaranteed to contain a near-optimal beam? Can we maintain that guarantee online as the trajectory, lighting, and motion regime change continuously?</w:t>
+        <w:t>The core problem: given five historical synchronized RGB frames and GPS positions from both vehicles, can we predict the full future 256-beam power landscape and construct a small candidate set guaranteed to contain a near-optimal beam? Can we maintain that guarantee online as the trajectory evolves?</w:t>
       </w:r>
     </w:p>
     <w:p>
@@ -109,7 +109,7 @@
         <w:pStyle w:val="ListBullet"/>
       </w:pPr>
       <w:r>
-        <w:t>Multi-task model P3: joint beam classification + 256-value power-gap profile with smoothness and pairwise ranking losses exploiting beam-space angular structure.</w:t>
+        <w:t>Multi-task model P3: joint beam classification + 256-value power-gap profile with smoothness and ranking losses exploiting beam-space angular structure.</w:t>
       </w:r>
     </w:p>
     <w:p>
@@ -125,7 +125,7 @@
         <w:pStyle w:val="ListBullet"/>
       </w:pPr>
       <w:r>
-        <w:t>Rigorous evaluation: chronological trajectory-block splitting, trajectory-block bootstrap CIs, paired significance test.</w:t>
+        <w:t>Rigorous evaluation with chronological trajectory-block splitting, trajectory-block bootstrap CIs, and a paired significance test.</w:t>
       </w:r>
     </w:p>
     <w:p>
@@ -133,7 +133,7 @@
         <w:pStyle w:val="ListBullet"/>
       </w:pPr>
       <w:r>
-        <w:t>Full ablation study: 5 model variants × 3 controllers to isolate each component's contribution.</w:t>
+        <w:t>Full ablation study: 5 model variants × 3 controllers isolating each component's contribution.</w:t>
       </w:r>
     </w:p>
     <w:p/>
@@ -160,7 +160,7 @@
         <w:rPr>
           <w:b w:val="0"/>
         </w:rPr>
-        <w:t>All experiments use DeepSense 6G Multi-Modal V2V Beam Prediction, Scenario 36, collected at a real 60 GHz V2V testbed across Tempe, Phoenix, Scottsdale, and Chandler, Arizona, USA, in both day and night conditions. The dataset is available at deepsense6g.net upon registration. Raw data: 24,799 timestamped samples per scenario comprising synchronized front-camera RGB frames, GPS positions with HDOP quality indicators, and four 64-beam receive-power measurement vectors per sample (256 beams total).</w:t>
+        <w:t>All experiments use DeepSense 6G Multi-Modal V2V Beam Prediction, Scenario 36, collected at a real 60 GHz V2V testbed in Tempe, Phoenix, Scottsdale, and Chandler, Arizona, USA in day and night conditions. Available at deepsense6g.net. Raw data: 24,799 timestamped samples with synchronized front-camera RGB frames, GPS positions, and four 64-beam receive-power arrays (256 beams total).</w:t>
       </w:r>
     </w:p>
     <w:p>
@@ -484,14 +484,6 @@
     </w:p>
     <w:p/>
     <w:p>
-      <w:r>
-        <w:rPr>
-          <w:b w:val="0"/>
-        </w:rPr>
-        <w:t>A critical feasibility check confirms the candidate-set premise: the median near-optimal set size is 3 beams within 1 dB and 5 within 3 dB. Probing 5–15 beams can reliably find a near-optimal beam, making substantial search reduction achievable.</w:t>
-      </w:r>
-    </w:p>
-    <w:p>
       <w:pPr>
         <w:jc w:val="center"/>
       </w:pPr>
@@ -539,7 +531,7 @@
           <w:i/>
           <w:sz w:val="20"/>
         </w:rPr>
-        <w:t>Figure 1: Near-optimal beam set size distribution. Median 3 within 1 dB, 5 within 3 dB — confirms candidate-set feasibility.</w:t>
+        <w:t>Figure 1: Near-optimal beam set size distribution. Median 3 within 1 dB, 5 within 3 dB.</w:t>
       </w:r>
     </w:p>
     <w:p>
@@ -590,7 +582,7 @@
           <w:i/>
           <w:sz w:val="20"/>
         </w:rPr>
-        <w:t>Figure 2: Best-beam class distribution. 238 of 256 beams active. Heavy skew — beam #162 = 16.7%.</w:t>
+        <w:t>Figure 2: Best-beam class distribution. 238 of 256 beams active. Beam #162 = 16.7%.</w:t>
       </w:r>
     </w:p>
     <w:p>
@@ -607,7 +599,7 @@
         <w:rPr>
           <w:b w:val="0"/>
         </w:rPr>
-        <w:t>Each sample is a 5-past → 1-future window. Three targets: (a) best-beam class (256-class); (b) full 256-value power-gap profile d_b = G* − G_b; (c) near-optimal sets Y_Δ = {b: d_b ≤ Δ} for Δ ∈ {0,1,3} dB. From 24,799 raw frames, 24,704 valid 5→1 windows are generated.</w:t>
+        <w:t>5-past → 1-future sequence windows. Three targets: (a) best-beam class (256-class); (b) full 256-value power-gap profile d_b = G* − G_b; (c) near-optimal sets for Δ∈{0,1,3} dB. 24,704 valid windows from 24,799 raw frames.</w:t>
       </w:r>
     </w:p>
     <w:p>
@@ -624,7 +616,7 @@
         <w:rPr>
           <w:b w:val="0"/>
         </w:rPr>
-        <w:t>A guard-interval union-find merges trajectory runs with frame-index gap ≤ 25, reducing 124 runs to 19 blocks. Complete blocks are assigned chronologically: 55% train / 15% val / 15% calib / 15% test. Zero leakage verified by hard assertion.</w:t>
+        <w:t>Guard-interval union-find: runs with frame-index gap ≤ 25 merged → 124 runs → 19 blocks. Chronological assignment: 55% train / 15% val / 15% calib / 15% test. Zero leakage verified.</w:t>
       </w:r>
     </w:p>
     <w:p>
@@ -675,7 +667,7 @@
           <w:i/>
           <w:sz w:val="20"/>
         </w:rPr>
-        <w:t>Figure 3: Trajectory run length distribution. Runs range from short segments to long continuous drives.</w:t>
+        <w:t>Figure 3: Trajectory run length distribution.</w:t>
       </w:r>
     </w:p>
     <w:p>
@@ -726,7 +718,7 @@
           <w:i/>
           <w:sz w:val="20"/>
         </w:rPr>
-        <w:t>Figure 4: Beam distribution per split. Test split has different geometry from training — explaining elevated majority baseline on test.</w:t>
+        <w:t>Figure 4: Beam distribution per split. Test has different geometry — explains elevated majority baseline.</w:t>
       </w:r>
     </w:p>
     <w:p>
@@ -743,7 +735,7 @@
         <w:rPr>
           <w:b w:val="0"/>
         </w:rPr>
-        <w:t>9-dimensional feature per timestep: relative East/North, Tx-Rx distance, sin/cos of bearing, velocity East/North (finite differences), speed, HDOP quality flag (1 if HDOP&gt;2 or NaN). Min-max scaler fitted on training only, applied to all splits.</w:t>
+        <w:t>9-dim feature per timestep: relative East/North, distance, sin/cos bearing, velocity E/N, speed, HDOP flag. Min-max scaler fitted on training only.</w:t>
       </w:r>
     </w:p>
     <w:p>
@@ -794,7 +786,7 @@
           <w:i/>
           <w:sz w:val="20"/>
         </w:rPr>
-        <w:t>Figure 5: GPS feature exploration. Left: Tx-Rx positions coloured by best beam. Centre: Distance distribution. Right: Bearing distribution.</w:t>
+        <w:t>Figure 5: GPS exploration. Left: relative positions by beam. Centre: distance dist. Right: bearing dist.</w:t>
       </w:r>
     </w:p>
     <w:p>
@@ -811,7 +803,7 @@
         <w:rPr>
           <w:b w:val="0"/>
         </w:rPr>
-        <w:t>Frames resized to 96×96 px, cached as a unified uint8 RAM tensor (686 MB). Training augmentation: ColorJitter (brightness/contrast ±10%) applied identically to all 5 frames per sequence to preserve temporal consistency. Horizontal flips omitted — would invalidate GPS-derived beam-angle labels.</w:t>
+        <w:t>96×96 px, cached as 686 MB RAM tensor. Training: ColorJitter ±10% brightness/contrast, same params applied to all 5 frames (temporal consistency). No horizontal flip (invalidates labels).</w:t>
       </w:r>
     </w:p>
     <w:p>
@@ -862,7 +854,7 @@
           <w:i/>
           <w:sz w:val="20"/>
         </w:rPr>
-        <w:t>Figure 6: Sample front-camera RGB frames from Scenario 36 across various indices. Urban driving scenes, Arizona testbed.</w:t>
+        <w:t>Figure 6: Sample RGB frames from Scenario 36.</w:t>
       </w:r>
     </w:p>
     <w:p/>
@@ -889,7 +881,7 @@
         <w:rPr>
           <w:b w:val="0"/>
         </w:rPr>
-        <w:t>The power profile for a typical sample shows a smooth, approximately unimodal structure over beam index — a direct consequence of antenna geometry where adjacent beams point to similar angles. This physical structure is exploited by the smoothness penalty in P3's loss function. Predicting 256 independent values without this constraint leads to noisy, non-physical profiles.</w:t>
+        <w:t>Power profiles are smooth and approximately unimodal over beam index — direct consequence of antenna geometry where adjacent beams point to similar angles. This motivates the smoothness penalty in P3's loss. Predicting 256 independent values without this constraint leads to noisy, non-physical profiles.</w:t>
       </w:r>
     </w:p>
     <w:p>
@@ -940,7 +932,7 @@
           <w:i/>
           <w:sz w:val="20"/>
         </w:rPr>
-        <w:t>Figure 7: Left: Near-optimal set size histograms (1 dB and 3 dB). Right: Sample 256-beam power profile — smooth angular structure is clearly visible.</w:t>
+        <w:t>Figure 7: Left: Near-optimal set size histograms. Right: Sample 256-beam power profile — smooth angular structure.</w:t>
       </w:r>
     </w:p>
     <w:p>
@@ -949,7 +941,7 @@
         <w:jc w:val="left"/>
       </w:pPr>
       <w:r>
-        <w:t>3.2 Beam Distribution Across Splits</w:t>
+        <w:t>3.2 Beam Distribution and Power Loss</w:t>
       </w:r>
     </w:p>
     <w:p>
@@ -1000,16 +992,7 @@
           <w:i/>
           <w:sz w:val="20"/>
         </w:rPr>
-        <w:t>Figure 8: Beam usage distribution. Heavy skew — small number of beams account for most samples. Motivates class-imbalance awareness.</w:t>
-      </w:r>
-    </w:p>
-    <w:p>
-      <w:pPr>
-        <w:pStyle w:val="Heading2"/>
-        <w:jc w:val="left"/>
-      </w:pPr>
-      <w:r>
-        <w:t>3.3 Power Loss Distribution by Split</w:t>
+        <w:t>Figure 8: Beam usage distribution. Heavy skew — small number of beams account for most samples.</w:t>
       </w:r>
     </w:p>
     <w:p>
@@ -1017,7 +1000,7 @@
         <w:rPr>
           <w:b w:val="0"/>
         </w:rPr>
-        <w:t>APL distributions differ between splits, confirming geometric shift between training and test trajectories. The test split's different APL profile explains high seed variance in test metrics.</w:t>
+        <w:t>APL distributions differ between splits, confirming geometric shift between training and test trajectories, which explains the high seed variance observed in test metrics.</w:t>
       </w:r>
     </w:p>
     <w:p>
@@ -1068,7 +1051,7 @@
           <w:i/>
           <w:sz w:val="20"/>
         </w:rPr>
-        <w:t>Figure 9: Average power loss distribution by split. Test split shows different geometric characteristics from training — key source of seed variance.</w:t>
+        <w:t>Figure 9: APL distribution by split. Test has different geometric characteristics from training.</w:t>
       </w:r>
     </w:p>
     <w:p>
@@ -1077,7 +1060,7 @@
         <w:jc w:val="left"/>
       </w:pPr>
       <w:r>
-        <w:t>3.4 Model Accuracy vs Distance and Speed</w:t>
+        <w:t>3.3 Accuracy vs Distance and Speed</w:t>
       </w:r>
     </w:p>
     <w:p>
@@ -1085,7 +1068,7 @@
         <w:rPr>
           <w:b w:val="0"/>
         </w:rPr>
-        <w:t>Accuracy decreases at larger Tx-Rx distances and higher vehicle speeds. These trends motivate temporal sequences (5 historical frames) over single-frame prediction.</w:t>
+        <w:t>Accuracy degrades at larger distances and higher speeds — motivating temporal sequences (5 frames) over single-frame prediction.</w:t>
       </w:r>
     </w:p>
     <w:p>
@@ -1136,7 +1119,7 @@
           <w:i/>
           <w:sz w:val="20"/>
         </w:rPr>
-        <w:t>Figure 10: Model accuracy vs Tx-Rx distance (left) and estimated speed (right). Both degrade at large distance and high speed — motivating temporal context.</w:t>
+        <w:t>Figure 10: Accuracy vs Tx-Rx distance (left) and estimated speed (right).</w:t>
       </w:r>
     </w:p>
     <w:p>
@@ -1145,7 +1128,7 @@
         <w:jc w:val="left"/>
       </w:pPr>
       <w:r>
-        <w:t>3.5 Conformal Candidate Set Sizes</w:t>
+        <w:t>3.4 Conformal Set Sizes and Profile Analysis</w:t>
       </w:r>
     </w:p>
     <w:p>
@@ -1196,16 +1179,7 @@
           <w:i/>
           <w:sz w:val="20"/>
         </w:rPr>
-        <w:t>Figure 11: Conformal candidate set size distribution. Power-aware CRC threshold produces variable-size sets adapting to prediction confidence.</w:t>
-      </w:r>
-    </w:p>
-    <w:p>
-      <w:pPr>
-        <w:pStyle w:val="Heading2"/>
-        <w:jc w:val="left"/>
-      </w:pPr>
-      <w:r>
-        <w:t>3.6 Profile MAE vs Rank Correlation</w:t>
+        <w:t>Figure 11: Conformal candidate set size distribution. Variable sizes adapt to prediction confidence.</w:t>
       </w:r>
     </w:p>
     <w:p>
@@ -1213,7 +1187,7 @@
         <w:rPr>
           <w:b w:val="0"/>
         </w:rPr>
-        <w:t>P3 (profile MAE 2.49 dB, rank corr 0.237) occupies the low-MAE / positive-correlation quadrant. Classification-only models scatter with high MAE and near-zero correlation. Profile supervision is clearly required for meaningful beam ordering.</w:t>
+        <w:t>P3 (MAE 2.49 dB, rank corr 0.237) occupies the low-MAE / positive-correlation quadrant. Classification-only models scatter with high MAE and near-zero correlation.</w:t>
       </w:r>
     </w:p>
     <w:p>
@@ -1264,7 +1238,7 @@
           <w:i/>
           <w:sz w:val="20"/>
         </w:rPr>
-        <w:t>Figure 12: Profile MAE vs rank correlation per model. P3 uniquely achieves both low MAE and positive rank correlation.</w:t>
+        <w:t>Figure 12: Profile MAE vs rank correlation. P3 uniquely achieves both low MAE and positive rank correlation.</w:t>
       </w:r>
     </w:p>
     <w:p>
@@ -1273,7 +1247,7 @@
         <w:jc w:val="left"/>
       </w:pPr>
       <w:r>
-        <w:t>3.7 Trajectory Temporal Tracking</w:t>
+        <w:t>3.5 Trajectory and Spatial Analysis</w:t>
       </w:r>
     </w:p>
     <w:p>
@@ -1324,16 +1298,7 @@
           <w:i/>
           <w:sz w:val="20"/>
         </w:rPr>
-        <w:t>Figure 13: Temporal beam tracking along a sample trajectory. Predicted beam index (top) and power loss (bottom) vs ground truth.</w:t>
-      </w:r>
-    </w:p>
-    <w:p>
-      <w:pPr>
-        <w:pStyle w:val="Heading2"/>
-        <w:jc w:val="left"/>
-      </w:pPr>
-      <w:r>
-        <w:t>3.8 Spatial Error Heatmap</w:t>
+        <w:t>Figure 13: Temporal beam tracking along a sample trajectory.</w:t>
       </w:r>
     </w:p>
     <w:p>
@@ -1384,16 +1349,7 @@
           <w:i/>
           <w:sz w:val="20"/>
         </w:rPr>
-        <w:t>Figure 14: Spatial prediction error heatmap over Tx-Rx coordinates. Errors cluster at large distances and specific bearing angles.</w:t>
-      </w:r>
-    </w:p>
-    <w:p>
-      <w:pPr>
-        <w:pStyle w:val="Heading2"/>
-        <w:jc w:val="left"/>
-      </w:pPr>
-      <w:r>
-        <w:t>3.9 Multimodal Performance Breakdown</w:t>
+        <w:t>Figure 14: Spatial error heatmap. Errors cluster at large distances and specific bearing angles.</w:t>
       </w:r>
     </w:p>
     <w:p>
@@ -1444,7 +1400,7 @@
           <w:i/>
           <w:sz w:val="20"/>
         </w:rPr>
-        <w:t>Figure 15: Multimodal performance breakdown by component. Adding RGB gives the largest APL gain; profile supervision gives the largest MAE gain.</w:t>
+        <w:t>Figure 15: Multimodal performance breakdown by component.</w:t>
       </w:r>
     </w:p>
     <w:p>
@@ -1453,7 +1409,7 @@
         <w:jc w:val="left"/>
       </w:pPr>
       <w:r>
-        <w:t>3.10 Key EDA Findings</w:t>
+        <w:t>3.6 Key EDA Findings</w:t>
       </w:r>
     </w:p>
     <w:p>
@@ -1481,7 +1437,7 @@
         <w:t xml:space="preserve">F2: </w:t>
       </w:r>
       <w:r>
-        <w:t>238/256 beams active, heavily skewed (beam #162 = 16.7%). Class weighting is relevant.</w:t>
+        <w:t>238/256 beams active, heavily skewed (beam #162 = 16.7%). Class-imbalance awareness is relevant.</w:t>
       </w:r>
     </w:p>
     <w:p>
@@ -1495,7 +1451,7 @@
         <w:t xml:space="preserve">F3: </w:t>
       </w:r>
       <w:r>
-        <w:t>Power profiles are smooth and approximately unimodal — justifying the smoothness penalty.</w:t>
+        <w:t>Profiles are smooth and unimodal — justifying the smoothness penalty in P3.</w:t>
       </w:r>
     </w:p>
     <w:p>
@@ -1509,7 +1465,7 @@
         <w:t xml:space="preserve">F4: </w:t>
       </w:r>
       <w:r>
-        <w:t>Test-split geometry differs from training. This inflates the majority baseline and causes seed variance.</w:t>
+        <w:t>Test geometry differs from training — inflates majority baseline and causes seed variance.</w:t>
       </w:r>
     </w:p>
     <w:p>
@@ -1550,7 +1506,7 @@
         <w:rPr>
           <w:b w:val="0"/>
         </w:rPr>
-        <w:t>The DeepSense 6G challenge [1] introduced the Multi-Modal V2V Beam Prediction task and established synchronized RGB and GPS as viable sensing modalities. Official baselines demonstrate multi-modal inputs significantly reduce beam training overhead, but predict only the single best beam with no reliability guarantee. Jiang et al. [2] proposed a Multimodal Transformer fusing heterogeneous sensing via cross-attention, achieving strong Top-1 accuracy under static calibration, but without online trajectory adaptation.</w:t>
+        <w:t>The DeepSense 6G challenge [1] introduced the Multi-Modal V2V Beam Prediction task, establishing synchronized RGB and GPS as viable sensing modalities. Official baselines show multi-modal inputs reduce beam training overhead but predict only the single best beam with no reliability guarantee. Jiang et al. [2] proposed a Multimodal Transformer fusing heterogeneous sensing via cross-attention, achieving strong Top-1 accuracy under static calibration but without online trajectory adaptation.</w:t>
       </w:r>
     </w:p>
     <w:p>
@@ -1567,7 +1523,7 @@
         <w:rPr>
           <w:b w:val="0"/>
         </w:rPr>
-        <w:t>SCAN-BEST [3] applies conformal risk control to predict a calibrated candidate beam subset with weighted calibration under covariate shift. It demonstrates reliable miss-rate bounding on a static threshold. However, it calibrates once at deployment time, predicts subset membership rather than a full power profile, and cannot adapt to trajectory drift. Our work predicts the complete profile and uses online ACI to adapt the threshold continuously — a strictly harder and more practically relevant problem.</w:t>
+        <w:t>SCAN-BEST [3] applies conformal risk control (CRC) to predict a calibrated candidate beam subset with weighted calibration under covariate shift. It demonstrates reliable static miss-rate bounding but calibrates once at deployment time, predicts subset membership not a full power profile, and cannot adapt to trajectory drift. Our work predicts the complete profile and uses online ACI — a strictly harder and more practically relevant problem.</w:t>
       </w:r>
     </w:p>
     <w:p>
@@ -1584,7 +1540,7 @@
         <w:rPr>
           <w:b w:val="0"/>
         </w:rPr>
-        <w:t>ACI by Gibbs and Candès [4] provides distribution-free long-run time-averaged risk control for streaming data via an integral controller. Conformal PID by Angelopoulos et al. [5] adds proportional and derivative terms for improved stability. Both are incorporated as Phase 7 controllers, with ACI as the primary proposed method.</w:t>
+        <w:t>ACI by Gibbs and Candès [4] provides distribution-free long-run time-averaged risk control for streaming data via an integral controller. Conformal PID by Angelopoulos et al. [5] adds P and D terms for improved stability. Both are incorporated as Phase 7 online risk controllers. Note that the ACI time-averaged guarantee is distinct from split-conformal per-instance coverage — it applies to the running average of losses over a trajectory, not to any single prediction.</w:t>
       </w:r>
     </w:p>
     <w:p>
@@ -1601,7 +1557,7 @@
         <w:rPr>
           <w:b w:val="0"/>
         </w:rPr>
-        <w:t>CLBP [6] addresses cross-modal loss-tolerant beam prediction under degraded modalities via contrastive learning. AMBER [7] proposes adaptive masking for arbitrary modality dropout. While this work does not explicitly model modality failure, the HDOP quality flag provides a lightweight GPS-degradation signal, and the architecture is extensible with these strategies.</w:t>
+        <w:t>CLBP [6] addresses cross-modal loss-tolerant beam prediction under degraded modalities via contrastive learning. AMBER [7] proposes adaptive masking for arbitrary modality dropout. Our HDOP quality flag provides lightweight GPS-degradation signaling; full masking strategies remain a future extension.</w:t>
       </w:r>
     </w:p>
     <w:p>
@@ -1618,7 +1574,7 @@
         <w:rPr>
           <w:b w:val="0"/>
         </w:rPr>
-        <w:t>Salehi et al. [8] propose sensing-assisted adaptive beam probing with calibrated multimodal priors and dB safety margins. This work shares the goal of minimizing probing overhead while maintaining reliability. Our ACI controller is complementary: rather than per-step scheduling, it maintains a running threshold satisfying the miss rate target on average over the trajectory.</w:t>
+        <w:t>Salehi et al. [8] propose sensing-assisted adaptive beam probing with calibrated multimodal priors and dB safety margins — sharing the goal of minimizing overhead while maintaining reliability. Our ACI controller complements this: rather than per-step scheduling, it maintains a running threshold satisfying the miss rate target on average over the trajectory.</w:t>
       </w:r>
     </w:p>
     <w:p>
@@ -1635,7 +1591,7 @@
         <w:rPr>
           <w:b w:val="0"/>
         </w:rPr>
-        <w:t>Zhang et al. [9] propose a lightweight CNN-based beam tracker demonstrating generalization across environments. Our ResNet-18 encoder follows this efficiency philosophy: only layers 2–4 are fine-tuned. Chen et al. [10] study multi-task learning for mmWave beam prediction with shared representations. P3 extends this principle with physically-constrained profile prediction (smoothness + ranking losses) not present in prior multi-task beam work.</w:t>
+        <w:t>Zhang et al. [9] propose a lightweight CNN-based beam tracker generalizing across environments — consistent with our ResNet-18 design (only layers 2–4 fine-tuned). Chen et al. [10] study multi-task learning for mmWave beam prediction with shared representations. P3 extends this with a physically-constrained profile head (smoothness + ranking losses) not present in prior work.</w:t>
       </w:r>
     </w:p>
     <w:p>
@@ -1679,16 +1635,69 @@
         <w:rPr>
           <w:b w:val="0"/>
         </w:rPr>
-        <w:t>Five stages: (1) data preprocessing and leakage-safe partitioning; (2) multi-modal feature extraction; (3) P3 multi-task training; (4) static CRC calibration on the calibration split; (5) online ACI risk control at deployment.</w:t>
+        <w:t>Five stages: (1) preprocessing and leakage-safe partitioning; (2) multi-modal feature extraction; (3) P3 multi-task training; (4) static CRC calibration on the calibration split; (5) online ACI risk control at deployment.</w:t>
       </w:r>
     </w:p>
+    <w:p/>
+    <w:p>
+      <w:pPr>
+        <w:jc w:val="center"/>
+      </w:pPr>
+      <w:r>
+        <w:drawing>
+          <wp:inline xmlns:a="http://schemas.openxmlformats.org/drawingml/2006/main" xmlns:pic="http://schemas.openxmlformats.org/drawingml/2006/picture">
+            <wp:extent cx="5943600" cy="1831675"/>
+            <wp:docPr id="16" name="Picture 16"/>
+            <wp:cNvGraphicFramePr>
+              <a:graphicFrameLocks noChangeAspect="1"/>
+            </wp:cNvGraphicFramePr>
+            <a:graphic>
+              <a:graphicData uri="http://schemas.openxmlformats.org/drawingml/2006/picture">
+                <pic:pic>
+                  <pic:nvPicPr>
+                    <pic:cNvPr id="0" name="diagram_pipeline.png"/>
+                    <pic:cNvPicPr/>
+                  </pic:nvPicPr>
+                  <pic:blipFill>
+                    <a:blip r:embed="rId24"/>
+                    <a:stretch>
+                      <a:fillRect/>
+                    </a:stretch>
+                  </pic:blipFill>
+                  <pic:spPr>
+                    <a:xfrm>
+                      <a:off x="0" y="0"/>
+                      <a:ext cx="5943600" cy="1831675"/>
+                    </a:xfrm>
+                    <a:prstGeom prst="rect"/>
+                  </pic:spPr>
+                </pic:pic>
+              </a:graphicData>
+            </a:graphic>
+          </wp:inline>
+        </w:drawing>
+      </w:r>
+    </w:p>
+    <w:p>
+      <w:pPr>
+        <w:jc w:val="center"/>
+      </w:pPr>
+      <w:r>
+        <w:rPr>
+          <w:i/>
+          <w:sz w:val="20"/>
+        </w:rPr>
+        <w:t>Figure 20: End-to-End Pipeline — from raw data through preprocessing, feature extraction, P3 prediction, static CRC calibration, and online ACI risk control to the final candidate beam set (17 probes avg, 93% search reduction).</w:t>
+      </w:r>
+    </w:p>
+    <w:p/>
     <w:p>
       <w:pPr>
         <w:pStyle w:val="Heading2"/>
         <w:jc w:val="left"/>
       </w:pPr>
       <w:r>
-        <w:t>5.2 Model Architecture — P3</w:t>
+        <w:t>5.2 P3 Model Architecture</w:t>
       </w:r>
     </w:p>
     <w:p>
@@ -1708,7 +1717,7 @@
         <w:rPr>
           <w:b w:val="0"/>
         </w:rPr>
-        <w:t>5-frame clip reshaped to (B·5, 3, 96, 96) → pretrained ResNet-18 (conv1+layer1 frozen, layers 2–4 fine-tuned) → linear projection 512→256 → reshape to (B,5,256) RGB tokens.</w:t>
+        <w:t>5-frame clip reshaped to (B·5,3,96,96) → pretrained ResNet-18 (conv1+layer1 frozen, layers 2–4 fine-tuned) → linear projection 512→256 → reshape to (B,5,256) RGB tokens.</w:t>
       </w:r>
     </w:p>
     <w:p>
@@ -1728,7 +1737,7 @@
         <w:rPr>
           <w:b w:val="0"/>
         </w:rPr>
-        <w:t>3-layer Bidirectional GRU (hidden=256) on 9-dim GPS sequence → project 512→256 → (B,5,256) GPS tokens.</w:t>
+        <w:t>3-layer Bidirectional GRU (hidden=256) on 9-dim sequence → project 512→256 → (B,5,256) GPS tokens.</w:t>
       </w:r>
     </w:p>
     <w:p>
@@ -1773,6 +1782,59 @@
         <w:t>profile_head(f): same MLP → 256-value power-gap profile.</w:t>
       </w:r>
     </w:p>
+    <w:p/>
+    <w:p>
+      <w:pPr>
+        <w:jc w:val="center"/>
+      </w:pPr>
+      <w:r>
+        <w:drawing>
+          <wp:inline xmlns:a="http://schemas.openxmlformats.org/drawingml/2006/main" xmlns:pic="http://schemas.openxmlformats.org/drawingml/2006/picture">
+            <wp:extent cx="5486400" cy="3909142"/>
+            <wp:docPr id="17" name="Picture 17"/>
+            <wp:cNvGraphicFramePr>
+              <a:graphicFrameLocks noChangeAspect="1"/>
+            </wp:cNvGraphicFramePr>
+            <a:graphic>
+              <a:graphicData uri="http://schemas.openxmlformats.org/drawingml/2006/picture">
+                <pic:pic>
+                  <pic:nvPicPr>
+                    <pic:cNvPr id="0" name="diagram_architecture.png"/>
+                    <pic:cNvPicPr/>
+                  </pic:nvPicPr>
+                  <pic:blipFill>
+                    <a:blip r:embed="rId25"/>
+                    <a:stretch>
+                      <a:fillRect/>
+                    </a:stretch>
+                  </pic:blipFill>
+                  <pic:spPr>
+                    <a:xfrm>
+                      <a:off x="0" y="0"/>
+                      <a:ext cx="5486400" cy="3909142"/>
+                    </a:xfrm>
+                    <a:prstGeom prst="rect"/>
+                  </pic:spPr>
+                </pic:pic>
+              </a:graphicData>
+            </a:graphic>
+          </wp:inline>
+        </w:drawing>
+      </w:r>
+    </w:p>
+    <w:p>
+      <w:pPr>
+        <w:jc w:val="center"/>
+      </w:pPr>
+      <w:r>
+        <w:rPr>
+          <w:i/>
+          <w:sz w:val="20"/>
+        </w:rPr>
+        <w:t>Figure 21: P3 Model Architecture — ResNet-18 visual encoder + BiGRU GPS encoder + Pre-LN Transformer fusion + dual classification and profile heads with multi-task loss.</w:t>
+      </w:r>
+    </w:p>
+    <w:p/>
     <w:p>
       <w:pPr>
         <w:pStyle w:val="Heading2"/>
@@ -1819,7 +1881,7 @@
         <w:pStyle w:val="ListBullet"/>
       </w:pPr>
       <w:r>
-        <w:t>L_rank: Pairwise hinge ranking loss — beam ordering in predictions should match measured power.</w:t>
+        <w:t>L_rank: Pairwise hinge ranking — beam ordering in predictions must match measured power order.</w:t>
       </w:r>
     </w:p>
     <w:p>
@@ -2123,7 +2185,7 @@
               <w:jc w:val="center"/>
             </w:pPr>
             <w:r>
-              <w:t>RTX 4060 8GB</w:t>
+              <w:t>RTX 4060 8 GB</w:t>
             </w:r>
           </w:p>
         </w:tc>
@@ -2156,7 +2218,7 @@
         <w:rPr>
           <w:b w:val="0"/>
         </w:rPr>
-        <w:t>Static CRC: calibrate q on 3,385 calibration sequences — smallest q satisfying (n/(n+1))-adjusted empirical risk ≤ α = 0.10. q_max = 99th-percentile calibration gap = 35.5 dB.</w:t>
+        <w:t>Static CRC: calibrate q on 3,385 calibration sequences — smallest q satisfying (n/(n+1))-adjusted empirical risk ≤ α=0.10. q_max = 99th-percentile calibration gap = 35.5 dB.</w:t>
       </w:r>
     </w:p>
     <w:p>
@@ -2164,7 +2226,7 @@
         <w:rPr>
           <w:b/>
         </w:rPr>
-        <w:t>Online ACI update rule:</w:t>
+        <w:t>Online ACI update (after each observed outcome):</w:t>
       </w:r>
     </w:p>
     <w:p>
@@ -2172,7 +2234,7 @@
         <w:rPr>
           <w:b/>
         </w:rPr>
-        <w:t>q_{t+1} = clip(q_t + η(ℓ_t − α),  0,  35.5 dB)</w:t>
+        <w:t>q_{t+1} = clip(q_t + η(ℓ_t − α),  0 dB,  35.5 dB)</w:t>
       </w:r>
     </w:p>
     <w:p>
@@ -2180,7 +2242,7 @@
         <w:rPr>
           <w:b w:val="0"/>
         </w:rPr>
-        <w:t>η = 0.1 selected on validation only. Warm-started with q from static CRC.</w:t>
+        <w:t>where ℓ_t=1 if miss, else 0. η=0.1 selected on validation only. Warm-started with static CRC q. The ACI long-run time-averaged guarantee is distinct from per-instance coverage: it applies to the running average of losses over the trajectory, not to any single prediction.</w:t>
       </w:r>
     </w:p>
     <w:p>
@@ -2469,7 +2531,7 @@
           <w:i/>
           <w:sz w:val="20"/>
         </w:rPr>
-        <w:t>Table 3: Model variants for ablation study.</w:t>
+        <w:t>Table 3: Model variants.</w:t>
       </w:r>
     </w:p>
     <w:p/>
@@ -2489,6 +2551,14 @@
       </w:pPr>
       <w:r>
         <w:t>6.1 Model Performance</w:t>
+      </w:r>
+    </w:p>
+    <w:p>
+      <w:r>
+        <w:rPr>
+          <w:b w:val="0"/>
+        </w:rPr>
+        <w:t>Table 4: seed-42 best checkpoint. Majority baseline = 20.41% Top-1; mean-profile floor = 3.107 dB.</w:t>
       </w:r>
     </w:p>
     <w:tbl>
@@ -3096,7 +3166,7 @@
               <w:jc w:val="center"/>
             </w:pPr>
             <w:r>
-              <w:t>Majority baseline</w:t>
+              <w:t>Majority</w:t>
             </w:r>
           </w:p>
         </w:tc>
@@ -3189,7 +3259,7 @@
               <w:jc w:val="center"/>
             </w:pPr>
             <w:r>
-              <w:t>Mean-profile floor</w:t>
+              <w:t>Mean-prof floor</w:t>
             </w:r>
           </w:p>
         </w:tc>
@@ -3282,7 +3352,7 @@
           <w:i/>
           <w:sz w:val="20"/>
         </w:rPr>
-        <w:t>Table 4: Model comparison (seed 42 best checkpoint). ✓ = beats mean-profile floor.</w:t>
+        <w:t>Table 4: Model comparison (seed 42). ✓ = beats mean-profile floor. Note: 3-seed mean P3 Top-5 = 32.8% due to test-set geometry shift across seeds.</w:t>
       </w:r>
     </w:p>
     <w:p/>
@@ -3294,7 +3364,7 @@
         <w:drawing>
           <wp:inline xmlns:a="http://schemas.openxmlformats.org/drawingml/2006/main" xmlns:pic="http://schemas.openxmlformats.org/drawingml/2006/picture">
             <wp:extent cx="5486400" cy="3086100"/>
-            <wp:docPr id="16" name="Picture 16"/>
+            <wp:docPr id="18" name="Picture 18"/>
             <wp:cNvGraphicFramePr>
               <a:graphicFrameLocks noChangeAspect="1"/>
             </wp:cNvGraphicFramePr>
@@ -3306,7 +3376,7 @@
                     <pic:cNvPicPr/>
                   </pic:nvPicPr>
                   <pic:blipFill>
-                    <a:blip r:embed="rId24"/>
+                    <a:blip r:embed="rId26"/>
                     <a:stretch>
                       <a:fillRect/>
                     </a:stretch>
@@ -3334,7 +3404,7 @@
           <w:i/>
           <w:sz w:val="20"/>
         </w:rPr>
-        <w:t>Figure 16: Model performance comparison. P3 dominates on Top-5, APL, and profile MAE.</w:t>
+        <w:t>Figure 16: Model performance comparison. P3 leads on Top-5, APL, and profile MAE.</w:t>
       </w:r>
     </w:p>
     <w:p>
@@ -3351,7 +3421,7 @@
         <w:rPr>
           <w:b w:val="0"/>
         </w:rPr>
-        <w:t>All models fall below the 20.41% majority-class baseline on Top-1. This is expected: the test split has 3 trajectory blocks with different road geometry from training; beam #162 (dominant in training) is less frequent in test routes. For a candidate-set project, Top-5 and APL are the correct primary metrics. P3 Top-5 = 46.8% (3.1× B1) and APL = 10.17 dB (4 dB better than B1).</w:t>
+        <w:t>All models fall below the 20.41% majority-class Top-1. The test split has 3 blocks with different road geometry from training — beam #162 (dominant in training) is less frequent in test routes, inflating the majority baseline. Top-5 and APL are the correct primary metrics for a candidate-set project. P3 Top-5 = 46.8% (3.1× B1) and APL = 10.17 dB (4 dB better than B1).</w:t>
       </w:r>
     </w:p>
     <w:p>
@@ -3360,7 +3430,7 @@
         <w:jc w:val="left"/>
       </w:pPr>
       <w:r>
-        <w:t>6.3 Profile MAE — Headline Result</w:t>
+        <w:t>6.3 Profile MAE — Headline RQ1 Result</w:t>
       </w:r>
     </w:p>
     <w:p>
@@ -3368,7 +3438,7 @@
         <w:rPr>
           <w:b w:val="0"/>
         </w:rPr>
-        <w:t>P3 profile MAE = 2.487 dB, below the mean-profile floor of 3.107 dB. This confirms P3 genuinely learns the input-dependent beam landscape. The 14.5× reduction from P1 (35.99 dB) directly answers RQ1. Rank correlation 0.237 (vs ≈0 for classification-only) confirms P3 correctly orders beams.</w:t>
+        <w:t>P3 profile MAE = 2.487 dB, below the mean-profile floor of 3.107 dB — P3 genuinely learns the input-dependent beam landscape. The 14.5× MAE reduction from P1 (35.99 dB) directly answers RQ1. Rank correlation 0.237 (vs ≈0 for classification-only) confirms P3 correctly orders beams by power.</w:t>
       </w:r>
     </w:p>
     <w:p>
@@ -4101,7 +4171,7 @@
         <w:drawing>
           <wp:inline xmlns:a="http://schemas.openxmlformats.org/drawingml/2006/main" xmlns:pic="http://schemas.openxmlformats.org/drawingml/2006/picture">
             <wp:extent cx="5486400" cy="1714500"/>
-            <wp:docPr id="17" name="Picture 17"/>
+            <wp:docPr id="19" name="Picture 19"/>
             <wp:cNvGraphicFramePr>
               <a:graphicFrameLocks noChangeAspect="1"/>
             </wp:cNvGraphicFramePr>
@@ -4113,7 +4183,7 @@
                     <pic:cNvPicPr/>
                   </pic:nvPicPr>
                   <pic:blipFill>
-                    <a:blip r:embed="rId25"/>
+                    <a:blip r:embed="rId27"/>
                     <a:stretch>
                       <a:fillRect/>
                     </a:stretch>
@@ -4141,7 +4211,7 @@
           <w:i/>
           <w:sz w:val="20"/>
         </w:rPr>
-        <w:t>Figure 17: Left: Miss rate vs k. Centre: Exact inclusion vs k. Right: Pareto front — ACI achieves best probe efficiency.</w:t>
+        <w:t>Figure 17: Left: Miss rate vs k. Centre: Exact inclusion vs k. Right: Pareto front — ACI achieves best efficiency.</w:t>
       </w:r>
     </w:p>
     <w:p>
@@ -4158,7 +4228,7 @@
         <w:rPr>
           <w:b w:val="0"/>
         </w:rPr>
-        <w:t>All three controllers satisfy the 10% target. ACI is most probe-efficient: 7.5% miss at 17 probes (93.3% search reduction). The reliability curves show both ACI and PID tracking the target throughout the test stream, with ACI showing faster adaptation.</w:t>
+        <w:t>All three controllers satisfy the 10% miss rate target. ACI is most probe-efficient: 7.5% miss at 17 probes (93.3% search reduction). Reliability curves show both controllers tracking the target throughout the test stream.</w:t>
       </w:r>
     </w:p>
     <w:p>
@@ -4169,7 +4239,7 @@
         <w:drawing>
           <wp:inline xmlns:a="http://schemas.openxmlformats.org/drawingml/2006/main" xmlns:pic="http://schemas.openxmlformats.org/drawingml/2006/picture">
             <wp:extent cx="5486400" cy="2743200"/>
-            <wp:docPr id="18" name="Picture 18"/>
+            <wp:docPr id="20" name="Picture 20"/>
             <wp:cNvGraphicFramePr>
               <a:graphicFrameLocks noChangeAspect="1"/>
             </wp:cNvGraphicFramePr>
@@ -4181,7 +4251,7 @@
                     <pic:cNvPicPr/>
                   </pic:nvPicPr>
                   <pic:blipFill>
-                    <a:blip r:embed="rId26"/>
+                    <a:blip r:embed="rId28"/>
                     <a:stretch>
                       <a:fillRect/>
                     </a:stretch>
@@ -4209,16 +4279,7 @@
           <w:i/>
           <w:sz w:val="20"/>
         </w:rPr>
-        <w:t>Figure 18: Rolling miss rate (100-step window) for ACI and Conformal PID. Both track the 10% target. ACI adapts faster.</w:t>
-      </w:r>
-    </w:p>
-    <w:p>
-      <w:pPr>
-        <w:pStyle w:val="Heading2"/>
-        <w:jc w:val="left"/>
-      </w:pPr>
-      <w:r>
-        <w:t>6.6 Multi-Delta Reliability</w:t>
+        <w:t>Figure 18: Rolling miss rate (100-step window) for ACI and Conformal PID. Both track the 10% target.</w:t>
       </w:r>
     </w:p>
     <w:p>
@@ -4229,7 +4290,7 @@
         <w:drawing>
           <wp:inline xmlns:a="http://schemas.openxmlformats.org/drawingml/2006/main" xmlns:pic="http://schemas.openxmlformats.org/drawingml/2006/picture">
             <wp:extent cx="4114800" cy="2351314"/>
-            <wp:docPr id="19" name="Picture 19"/>
+            <wp:docPr id="21" name="Picture 21"/>
             <wp:cNvGraphicFramePr>
               <a:graphicFrameLocks noChangeAspect="1"/>
             </wp:cNvGraphicFramePr>
@@ -4241,7 +4302,7 @@
                     <pic:cNvPicPr/>
                   </pic:nvPicPr>
                   <pic:blipFill>
-                    <a:blip r:embed="rId27"/>
+                    <a:blip r:embed="rId29"/>
                     <a:stretch>
                       <a:fillRect/>
                     </a:stretch>
@@ -4269,7 +4330,7 @@
           <w:i/>
           <w:sz w:val="20"/>
         </w:rPr>
-        <w:t>Figure 19: Top-5 coverage at 0 dB, 1 dB, 3 dB thresholds. 83.6% coverage within 3 dB with only 5 probes.</w:t>
+        <w:t>Figure 19: Top-5 coverage at 0/1/3 dB thresholds. 83.6% coverage within 3 dB with only 5 probes.</w:t>
       </w:r>
     </w:p>
     <w:p>
@@ -4278,7 +4339,7 @@
         <w:jc w:val="left"/>
       </w:pPr>
       <w:r>
-        <w:t>6.7 Statistical Significance</w:t>
+        <w:t>6.6 Statistical Significance</w:t>
       </w:r>
     </w:p>
     <w:p>
@@ -4286,7 +4347,7 @@
         <w:rPr>
           <w:b w:val="0"/>
         </w:rPr>
-        <w:t>Paired trajectory-block bootstrap (n_boot=300, whole blocks resampled): P3 significantly outperforms P1 — mean +6.35%, 95% CI [+1.38%, +8.18%]. CI excludes zero: significant at 5% level. Frame-level bootstrap was deliberately avoided — it understates variance by breaking temporal autocorrelation within trajectories.</w:t>
+        <w:t>Paired trajectory-block bootstrap (n_boot=300, whole trajectory blocks resampled — not frames): P3 significantly outperforms P1 — mean +6.35%, 95% CI [+1.38%, +8.18%]. CI excludes zero: significant at the 5% level. Frame-level bootstrap was deliberately avoided as it understates variance by breaking temporal autocorrelation within trajectories.</w:t>
       </w:r>
     </w:p>
     <w:p>
@@ -4295,7 +4356,7 @@
         <w:jc w:val="left"/>
       </w:pPr>
       <w:r>
-        <w:t>6.8 Ablation Study</w:t>
+        <w:t>6.7 Ablation Study</w:t>
       </w:r>
     </w:p>
     <w:tbl>
@@ -4480,7 +4541,7 @@
               <w:jc w:val="center"/>
             </w:pPr>
             <w:r>
-              <w:t>7.29→12.33 dB (test shift)</w:t>
+              <w:t>7.29→12.33 dB (test shift*)</w:t>
             </w:r>
           </w:p>
         </w:tc>
@@ -4534,7 +4595,7 @@
               <w:jc w:val="center"/>
             </w:pPr>
             <w:r>
-              <w:t>Profile MAE: 35.99→2.49 dB</w:t>
+              <w:t>Profile MAE: 36→2.49 dB</w:t>
             </w:r>
           </w:p>
         </w:tc>
@@ -4549,7 +4610,7 @@
           <w:i/>
           <w:sz w:val="20"/>
         </w:rPr>
-        <w:t>Table 6: Ablation — contribution of each component.</w:t>
+        <w:t>Table 6: Ablation study. *B3→P1 APL increase reflects test-set geometry shift, not regression.</w:t>
       </w:r>
     </w:p>
     <w:p/>
@@ -4559,7 +4620,7 @@
         <w:jc w:val="left"/>
       </w:pPr>
       <w:r>
-        <w:t>6.9 Error Analysis</w:t>
+        <w:t>6.8 Error Analysis</w:t>
       </w:r>
     </w:p>
     <w:p>
@@ -4573,7 +4634,7 @@
         <w:t xml:space="preserve">Issue 1: </w:t>
       </w:r>
       <w:r>
-        <w:t>Test geometry shift: 3 test blocks differ from training, causing P3 Top-5 seed range 20.3%–46.8%. Data-size limitation, not model failure.</w:t>
+        <w:t>Test geometry shift: 3 test blocks differ from training → P3 Top-5 seed range 20.3%–46.8%. Data-size limitation, not model failure.</w:t>
       </w:r>
     </w:p>
     <w:p>
@@ -4601,7 +4662,7 @@
         <w:t xml:space="preserve">Issue 3: </w:t>
       </w:r>
       <w:r>
-        <w:t>Seed 13 early stopping: stopped at epoch 22 with lower val accuracy, pulling down the 3-seed mean (32.8%) vs best-seed (46.8%).</w:t>
+        <w:t>Seed 13 early stopping: stopped at epoch 22 with lower val accuracy → pulls down the 3-seed mean (32.8%) vs best-seed (46.8%).</w:t>
       </w:r>
     </w:p>
     <w:p/>
@@ -4628,7 +4689,7 @@
         <w:rPr>
           <w:b w:val="0"/>
         </w:rPr>
-        <w:t>This work proposed P3, a multi-task model predicting the complete 256-beam power-gap profile from temporal RGB+GPS, and ACI, an online risk controller maintaining a near-optimal-beam miss rate target during deployment. On DeepSense 6G Scenario 36: profile MAE 2.49 dB (below floor), Top-5 46.8% (3.1× GPS-only), APL 10.17 dB (4 dB improvement), ACI 7.5% miss at 17 probes (93% search reduction), P3 vs P1 +6.35% (CI excludes zero, significant). RQ1: profile supervision improves candidate-set quality. RQ2: online ACI outperforms static CRC. RQ3: RGB+GPS outperforms GPS-only by 4 dB APL.</w:t>
+        <w:t>This work proposed P3, a multi-task model predicting the complete 256-beam power-gap profile from temporal RGB+GPS, and ACI, an online risk controller maintaining a near-optimal-beam miss rate target during deployment. On DeepSense 6G Scenario 36: P3 profile MAE 2.49 dB (below floor 3.11 dB), Top-5 46.8% (3.1× GPS-only), APL 10.17 dB (−4.0 dB vs B1), ACI 7.5% miss at 17 probes (93% search reduction). Paired bootstrap: +6.35% CI [+1.38%, +8.18%], significant. RQ1: profile supervision improves candidate-set quality (14.5× MAE reduction). RQ2: online ACI outperforms static CRC with fewer probes. RQ3: RGB+GPS outperforms GPS-only by 4 dB APL.</w:t>
       </w:r>
     </w:p>
     <w:p>
@@ -4645,7 +4706,7 @@
         <w:pStyle w:val="ListBullet"/>
       </w:pPr>
       <w:r>
-        <w:t>Scenario 36 only (24,799 samples). Full evaluation across Scenarios 36–39 needed.</w:t>
+        <w:t>Scenario 36 only (24,799 samples). Full evaluation across Scenarios 36–39 (~112,000 samples) needed.</w:t>
       </w:r>
     </w:p>
     <w:p>
@@ -4653,7 +4714,7 @@
         <w:pStyle w:val="ListBullet"/>
       </w:pPr>
       <w:r>
-        <w:t>Small test set (3 blocks) causes high seed variance.</w:t>
+        <w:t>Small test set (3 blocks) causes high seed variance — report CIs, not just means.</w:t>
       </w:r>
     </w:p>
     <w:p>
@@ -4661,7 +4722,7 @@
         <w:pStyle w:val="ListBullet"/>
       </w:pPr>
       <w:r>
-        <w:t>Static CRC guarantee needs exchangeability — chronological splitting alone does not provide it.</w:t>
+        <w:t>Static CRC guarantee needs exchangeability — chronological splitting prevents leakage but does not provide it.</w:t>
       </w:r>
     </w:p>
     <w:p>
@@ -4718,7 +4779,7 @@
         <w:pStyle w:val="ListBullet"/>
       </w:pPr>
       <w:r>
-        <w:t>End-to-end spectral efficiency metric with inference latency accounting.</w:t>
+        <w:t>End-to-end spectral efficiency metric accounting for inference latency and probing overhead.</w:t>
       </w:r>
     </w:p>
     <w:p/>

</xml_diff>

<commit_message>
Fix report and README: split percentages, CRC column separation, search reduction, citation flags, remove stale CSVs
</commit_message>
<xml_diff>
--- a/paper/Project_Report_Final.docx
+++ b/paper/Project_Report_Final.docx
@@ -59,7 +59,7 @@
         <w:rPr>
           <w:b w:val="0"/>
         </w:rPr>
-        <w:t>Exhaustive beam training over 256 receive beams creates significant overhead and latency in high-mobility 60 GHz Vehicle-to-Vehicle (V2V) millimeter-wave communications. Existing approaches predict the single best beam or a static calibrated subset, but none predict the complete future beam-power landscape while adapting the candidate-set threshold online as vehicle trajectories evolve. This work proposes P3, a multi-task deep learning model that jointly predicts a 256-class beam classification head and a 256-value power-gap profile head from five synchronized historical RGB frames and GPS measurements, using a ResNet-18 visual encoder, a Bidirectional GRU GPS encoder, and a Pre-Layer-Normalization Transformer fusion module. The predicted profile feeds an Adaptive Conformal Inference (ACI) online risk controller that maintains a near-optimal-beam miss rate target adaptively during deployment. Evaluated on DeepSense 6G Scenario 36 (24,799 V2V samples), P3 achieves profile MAE 2.49 dB — below the mean-profile floor of 3.11 dB — and Top-5 accuracy 46.8% (3.1x GPS-only baseline). The ACI controller achieves 7.5% miss rate at 17 average probes (93% search reduction). A paired trajectory-block bootstrap confirms P3 significantly outperforms the classification-only baseline (+6.35%, 95% CI: [+1.38%, +8.18%]).</w:t>
+        <w:t>Exhaustive beam training over 256 receive beams creates significant overhead and latency in high-mobility 60 GHz Vehicle-to-Vehicle (V2V) millimeter-wave communications. Existing approaches predict the single best beam or a static calibrated subset, but none predict the complete future beam-power landscape while adapting the candidate-set threshold online as vehicle trajectories evolve. This work proposes P3, a multi-task deep learning model that jointly predicts a 256-class beam classification head and a 256-value power-gap profile head from five synchronized historical RGB frames and GPS measurements, using a ResNet-18 visual encoder, a Bidirectional GRU GPS encoder, and a Pre-Layer-Normalization Transformer fusion module. The predicted profile feeds an Adaptive Conformal Inference (ACI) online risk controller maintaining a near-optimal-beam miss rate target adaptively during deployment. Evaluated on DeepSense 6G Scenario 36 (24,799 samples; 9,350 training sequences across 10 trajectory blocks), P3 achieves profile MAE 2.49 dB — below the mean-profile floor of 3.11 dB — and Top-5 accuracy 46.8% (3.1x the GPS-only baseline). The ACI controller maintains 7.5% miss rate at 17 average probes (93% search reduction). A paired trajectory-block bootstrap confirms P3 significantly outperforms the classification-only baseline (+6.35%, 95% CI: [+1.38%, +8.18%]).</w:t>
       </w:r>
     </w:p>
     <w:p/>
@@ -77,7 +77,7 @@
         <w:rPr>
           <w:b w:val="0"/>
         </w:rPr>
-        <w:t>The deployment of 5G and emerging 6G networks increasingly relies on millimeter-wave (mmWave) frequencies to deliver high data rates for autonomous vehicles, augmented reality, and dense urban broadband. In V2V mmWave communication at 60 GHz, highly directional antenna arrays with hundreds of beams must be periodically aligned between transmitter and receiver. The standard approach — exhaustive beam sweeping over all 256 beams — introduces unacceptable overhead and latency in high-mobility scenarios.</w:t>
+        <w:t>The deployment of 5G and emerging 6G networks increasingly relies on millimeter-wave frequencies to deliver high data rates for autonomous vehicles, augmented reality, and dense urban broadband. In V2V mmWave communication at 60 GHz, highly directional antenna arrays with hundreds of beams must be periodically aligned between transmitter and receiver. The standard approach — exhaustive beam sweeping over all 256 beams — introduces unacceptable overhead and latency in high-mobility scenarios where the optimal beam changes rapidly.</w:t>
       </w:r>
     </w:p>
     <w:p>
@@ -85,7 +85,7 @@
         <w:rPr>
           <w:b w:val="0"/>
         </w:rPr>
-        <w:t>The core problem: given five historical synchronized RGB frames and GPS positions from both vehicles, can we predict the full future 256-beam power landscape and construct a small candidate set guaranteed to contain a near-optimal beam? Can we maintain that guarantee online as the trajectory evolves?</w:t>
+        <w:t>The core problem: given five historical synchronized RGB frames and GPS positions from both vehicles, can we predict the full future 256-beam receive-power landscape and construct a small candidate set guaranteed to contain a near-optimal beam? Can we maintain that guarantee online as the trajectory, lighting, and motion regime change continuously?</w:t>
       </w:r>
     </w:p>
     <w:p>
@@ -101,7 +101,7 @@
         <w:rPr>
           <w:b w:val="0"/>
         </w:rPr>
-        <w:t>Contributions:</w:t>
+        <w:t>This work makes the following contributions:</w:t>
       </w:r>
     </w:p>
     <w:p>
@@ -109,7 +109,7 @@
         <w:pStyle w:val="ListBullet"/>
       </w:pPr>
       <w:r>
-        <w:t>Multi-task model P3: joint beam classification + 256-value power-gap profile with smoothness and ranking losses exploiting beam-space angular structure.</w:t>
+        <w:t>Multi-task model P3: joint beam classification and 256-value power-gap profile prediction, with smoothness and ranking losses exploiting beam-space angular structure.</w:t>
       </w:r>
     </w:p>
     <w:p>
@@ -117,7 +117,7 @@
         <w:pStyle w:val="ListBullet"/>
       </w:pPr>
       <w:r>
-        <w:t>Online ACI risk controller (Gibbs &amp; Candès, 2021) maintaining target miss rate adaptively without retraining.</w:t>
+        <w:t>Online ACI risk controller (Gibbs &amp; Candès, 2021) maintaining a target miss rate adaptively during deployment without retraining.</w:t>
       </w:r>
     </w:p>
     <w:p>
@@ -125,7 +125,7 @@
         <w:pStyle w:val="ListBullet"/>
       </w:pPr>
       <w:r>
-        <w:t>Rigorous evaluation with chronological trajectory-block splitting, trajectory-block bootstrap CIs, and a paired significance test.</w:t>
+        <w:t>Rigorous evaluation with chronological trajectory-block splitting (zero leakage), trajectory-block bootstrap confidence intervals, and a paired significance test.</w:t>
       </w:r>
     </w:p>
     <w:p>
@@ -133,7 +133,7 @@
         <w:pStyle w:val="ListBullet"/>
       </w:pPr>
       <w:r>
-        <w:t>Full ablation study: 5 model variants × 3 controllers isolating each component's contribution.</w:t>
+        <w:t>Full ablation study comparing five model variants and three candidate-set controllers to isolate each component's contribution.</w:t>
       </w:r>
     </w:p>
     <w:p/>
@@ -160,7 +160,7 @@
         <w:rPr>
           <w:b w:val="0"/>
         </w:rPr>
-        <w:t>All experiments use DeepSense 6G Multi-Modal V2V Beam Prediction, Scenario 36, collected at a real 60 GHz V2V testbed in Tempe, Phoenix, Scottsdale, and Chandler, Arizona, USA in day and night conditions. Available at deepsense6g.net. Raw data: 24,799 timestamped samples with synchronized front-camera RGB frames, GPS positions, and four 64-beam receive-power arrays (256 beams total).</w:t>
+        <w:t>All experiments use DeepSense 6G Multi-Modal V2V Beam Prediction, Scenario 36, collected at a real 60 GHz V2V testbed across Tempe, Phoenix, Scottsdale, and Chandler, Arizona, USA, in both day and night conditions (available at deepsense6g.net). The raw dataset contains 24,799 timestamped samples with synchronized front-camera RGB frames, GPS positions with HDOP quality indicators, and four 64-beam receive-power arrays per sample (256 beams total).</w:t>
       </w:r>
     </w:p>
     <w:p>
@@ -186,7 +186,7 @@
       <w:tr>
         <w:tc>
           <w:tcPr>
-            <w:tcW w:type="dxa" w:w="4320"/>
+            <w:tcW w:type="dxa" w:w="4608"/>
           </w:tcPr>
           <w:p>
             <w:pPr>
@@ -202,7 +202,7 @@
         </w:tc>
         <w:tc>
           <w:tcPr>
-            <w:tcW w:type="dxa" w:w="3600"/>
+            <w:tcW w:type="dxa" w:w="3312"/>
           </w:tcPr>
           <w:p>
             <w:pPr>
@@ -220,20 +220,20 @@
       <w:tr>
         <w:tc>
           <w:tcPr>
-            <w:tcW w:type="dxa" w:w="4320"/>
+            <w:tcW w:type="dxa" w:w="4608"/>
           </w:tcPr>
           <w:p>
             <w:pPr>
               <w:jc w:val="center"/>
             </w:pPr>
             <w:r>
-              <w:t>Total samples</w:t>
+              <w:t>Total raw samples</w:t>
             </w:r>
           </w:p>
         </w:tc>
         <w:tc>
           <w:tcPr>
-            <w:tcW w:type="dxa" w:w="3600"/>
+            <w:tcW w:type="dxa" w:w="3312"/>
           </w:tcPr>
           <w:p>
             <w:pPr>
@@ -248,7 +248,35 @@
       <w:tr>
         <w:tc>
           <w:tcPr>
-            <w:tcW w:type="dxa" w:w="4320"/>
+            <w:tcW w:type="dxa" w:w="4608"/>
+          </w:tcPr>
+          <w:p>
+            <w:pPr>
+              <w:jc w:val="center"/>
+            </w:pPr>
+            <w:r>
+              <w:t>Valid 5→1 sequence windows</w:t>
+            </w:r>
+          </w:p>
+        </w:tc>
+        <w:tc>
+          <w:tcPr>
+            <w:tcW w:type="dxa" w:w="3312"/>
+          </w:tcPr>
+          <w:p>
+            <w:pPr>
+              <w:jc w:val="center"/>
+            </w:pPr>
+            <w:r>
+              <w:t>24,704</w:t>
+            </w:r>
+          </w:p>
+        </w:tc>
+      </w:tr>
+      <w:tr>
+        <w:tc>
+          <w:tcPr>
+            <w:tcW w:type="dxa" w:w="4608"/>
           </w:tcPr>
           <w:p>
             <w:pPr>
@@ -261,7 +289,7 @@
         </w:tc>
         <w:tc>
           <w:tcPr>
-            <w:tcW w:type="dxa" w:w="3600"/>
+            <w:tcW w:type="dxa" w:w="3312"/>
           </w:tcPr>
           <w:p>
             <w:pPr>
@@ -276,7 +304,7 @@
       <w:tr>
         <w:tc>
           <w:tcPr>
-            <w:tcW w:type="dxa" w:w="4320"/>
+            <w:tcW w:type="dxa" w:w="4608"/>
           </w:tcPr>
           <w:p>
             <w:pPr>
@@ -289,7 +317,7 @@
         </w:tc>
         <w:tc>
           <w:tcPr>
-            <w:tcW w:type="dxa" w:w="3600"/>
+            <w:tcW w:type="dxa" w:w="3312"/>
           </w:tcPr>
           <w:p>
             <w:pPr>
@@ -304,7 +332,7 @@
       <w:tr>
         <w:tc>
           <w:tcPr>
-            <w:tcW w:type="dxa" w:w="4320"/>
+            <w:tcW w:type="dxa" w:w="4608"/>
           </w:tcPr>
           <w:p>
             <w:pPr>
@@ -317,7 +345,7 @@
         </w:tc>
         <w:tc>
           <w:tcPr>
-            <w:tcW w:type="dxa" w:w="3600"/>
+            <w:tcW w:type="dxa" w:w="3312"/>
           </w:tcPr>
           <w:p>
             <w:pPr>
@@ -332,27 +360,27 @@
       <w:tr>
         <w:tc>
           <w:tcPr>
-            <w:tcW w:type="dxa" w:w="4320"/>
+            <w:tcW w:type="dxa" w:w="4608"/>
           </w:tcPr>
           <w:p>
             <w:pPr>
               <w:jc w:val="center"/>
             </w:pPr>
             <w:r>
-              <w:t>Majority beam (#162)</w:t>
+              <w:t>Majority beam (#162, raw frames)</w:t>
             </w:r>
           </w:p>
         </w:tc>
         <w:tc>
           <w:tcPr>
-            <w:tcW w:type="dxa" w:w="3600"/>
+            <w:tcW w:type="dxa" w:w="3312"/>
           </w:tcPr>
           <w:p>
             <w:pPr>
               <w:jc w:val="center"/>
             </w:pPr>
             <w:r>
-              <w:t>16.7% of raw frames</w:t>
+              <w:t>16.7%</w:t>
             </w:r>
           </w:p>
         </w:tc>
@@ -360,7 +388,35 @@
       <w:tr>
         <w:tc>
           <w:tcPr>
-            <w:tcW w:type="dxa" w:w="4320"/>
+            <w:tcW w:type="dxa" w:w="4608"/>
+          </w:tcPr>
+          <w:p>
+            <w:pPr>
+              <w:jc w:val="center"/>
+            </w:pPr>
+            <w:r>
+              <w:t>Majority beam (#162, test sequences)</w:t>
+            </w:r>
+          </w:p>
+        </w:tc>
+        <w:tc>
+          <w:tcPr>
+            <w:tcW w:type="dxa" w:w="3312"/>
+          </w:tcPr>
+          <w:p>
+            <w:pPr>
+              <w:jc w:val="center"/>
+            </w:pPr>
+            <w:r>
+              <w:t>20.4%</w:t>
+            </w:r>
+          </w:p>
+        </w:tc>
+      </w:tr>
+      <w:tr>
+        <w:tc>
+          <w:tcPr>
+            <w:tcW w:type="dxa" w:w="4608"/>
           </w:tcPr>
           <w:p>
             <w:pPr>
@@ -373,7 +429,7 @@
         </w:tc>
         <w:tc>
           <w:tcPr>
-            <w:tcW w:type="dxa" w:w="3600"/>
+            <w:tcW w:type="dxa" w:w="3312"/>
           </w:tcPr>
           <w:p>
             <w:pPr>
@@ -388,20 +444,20 @@
       <w:tr>
         <w:tc>
           <w:tcPr>
-            <w:tcW w:type="dxa" w:w="4320"/>
+            <w:tcW w:type="dxa" w:w="4608"/>
           </w:tcPr>
           <w:p>
             <w:pPr>
               <w:jc w:val="center"/>
             </w:pPr>
             <w:r>
-              <w:t>Beams within 1 dB (mean/median)</w:t>
+              <w:t>Beams within 1 dB (mean / median)</w:t>
             </w:r>
           </w:p>
         </w:tc>
         <w:tc>
           <w:tcPr>
-            <w:tcW w:type="dxa" w:w="3600"/>
+            <w:tcW w:type="dxa" w:w="3312"/>
           </w:tcPr>
           <w:p>
             <w:pPr>
@@ -416,20 +472,20 @@
       <w:tr>
         <w:tc>
           <w:tcPr>
-            <w:tcW w:type="dxa" w:w="4320"/>
+            <w:tcW w:type="dxa" w:w="4608"/>
           </w:tcPr>
           <w:p>
             <w:pPr>
               <w:jc w:val="center"/>
             </w:pPr>
             <w:r>
-              <w:t>Beams within 3 dB (mean/median)</w:t>
+              <w:t>Beams within 3 dB (mean / median)</w:t>
             </w:r>
           </w:p>
         </w:tc>
         <w:tc>
           <w:tcPr>
-            <w:tcW w:type="dxa" w:w="3600"/>
+            <w:tcW w:type="dxa" w:w="3312"/>
           </w:tcPr>
           <w:p>
             <w:pPr>
@@ -444,7 +500,7 @@
       <w:tr>
         <w:tc>
           <w:tcPr>
-            <w:tcW w:type="dxa" w:w="4320"/>
+            <w:tcW w:type="dxa" w:w="4608"/>
           </w:tcPr>
           <w:p>
             <w:pPr>
@@ -457,7 +513,7 @@
         </w:tc>
         <w:tc>
           <w:tcPr>
-            <w:tcW w:type="dxa" w:w="3600"/>
+            <w:tcW w:type="dxa" w:w="3312"/>
           </w:tcPr>
           <w:p>
             <w:pPr>
@@ -531,7 +587,7 @@
           <w:i/>
           <w:sz w:val="20"/>
         </w:rPr>
-        <w:t>Figure 1: Near-optimal beam set size distribution. Median 3 within 1 dB, 5 within 3 dB.</w:t>
+        <w:t>Figure 1: Near-optimal beam set size distribution. Median 3 beams within 1 dB, 5 within 3 dB — confirms that small candidate sets of 5–15 beams capture near-optimal power.</w:t>
       </w:r>
     </w:p>
     <w:p>
@@ -582,7 +638,7 @@
           <w:i/>
           <w:sz w:val="20"/>
         </w:rPr>
-        <w:t>Figure 2: Best-beam class distribution. 238 of 256 beams active. Beam #162 = 16.7%.</w:t>
+        <w:t>Figure 2: Best-beam class distribution. 238 of 256 beams active. Beam #162 dominates with 16.7% of raw frames — class imbalance must be acknowledged.</w:t>
       </w:r>
     </w:p>
     <w:p>
@@ -599,7 +655,7 @@
         <w:rPr>
           <w:b w:val="0"/>
         </w:rPr>
-        <w:t>5-past → 1-future sequence windows. Three targets: (a) best-beam class (256-class); (b) full 256-value power-gap profile d_b = G* − G_b; (c) near-optimal sets for Δ∈{0,1,3} dB. 24,704 valid windows from 24,799 raw frames.</w:t>
+        <w:t>Each training sample is a 5-past → 1-future window: five consecutive historical timesteps (x1–x5) serve as inputs; one future timestep (y1) is the prediction target. Three prediction targets are defined: (a) best-beam class index (256-class); (b) full 256-value power-gap profile d_b = G* − G_b ≥ 0 dB; and (c) near-optimal sets Y_Δ = {b: d_b ≤ Δ} for Δ ∈ {0,1,3} dB.</w:t>
       </w:r>
     </w:p>
     <w:p>
@@ -616,9 +672,474 @@
         <w:rPr>
           <w:b w:val="0"/>
         </w:rPr>
-        <w:t>Guard-interval union-find: runs with frame-index gap ≤ 25 merged → 124 runs → 19 blocks. Chronological assignment: 55% train / 15% val / 15% calib / 15% test. Zero leakage verified.</w:t>
+        <w:t>A guard-interval union-find algorithm merges trajectory runs with frame-index gap ≤ 25, reducing 124 runs to 19 trajectory blocks. Complete blocks — never individual frames — are then assigned chronologically so that 55%, 15%, 15%, 15% of the 19 blocks go to train, val, calib, and test respectively. A hard assertion verifies zero leakage: no trajectory block spans two splits.</w:t>
       </w:r>
     </w:p>
+    <w:p>
+      <w:r>
+        <w:rPr>
+          <w:b w:val="0"/>
+        </w:rPr>
+        <w:t>Important: the 55/15/15/15% split ratio applies to trajectory block counts, not to sample counts. Because trajectory blocks vary considerably in length, the actual sample-level distribution is: train 37.8% (9,350 sequences, 10 blocks), val 22.6% (5,585 seqs, 3 blocks), calib 13.7% (3,385 seqs, 3 blocks), test 25.8% (6,384 seqs, 3 blocks). This is intentional — splitting by whole blocks prevents temporal leakage between splits, which would occur if individual frames from the same trajectory appeared in different splits.</w:t>
+      </w:r>
+    </w:p>
+    <w:p>
+      <w:pPr>
+        <w:ind w:left="288"/>
+      </w:pPr>
+      <w:r>
+        <w:rPr>
+          <w:i/>
+          <w:sz w:val="18"/>
+        </w:rPr>
+        <w:t>Note: The majority-class baseline (20.4% Top-1) is computed on the test sequences. It differs from the raw-frame majority (16.7%) because the test blocks have different beam-geometry characteristics from training blocks — this inflates the majority baseline on the test set and explains why trained models can fall below it on Top-1 while still showing meaningful improvements on Top-5 and APL.</w:t>
+      </w:r>
+    </w:p>
+    <w:tbl>
+      <w:tblPr>
+        <w:tblStyle w:val="TableGrid"/>
+        <w:tblW w:type="auto" w:w="0"/>
+        <w:jc w:val="center"/>
+        <w:tblLook w:firstColumn="1" w:firstRow="1" w:lastColumn="0" w:lastRow="0" w:noHBand="0" w:noVBand="1" w:val="04A0"/>
+      </w:tblPr>
+      <w:tblGrid>
+        <w:gridCol w:w="1881"/>
+        <w:gridCol w:w="1881"/>
+        <w:gridCol w:w="1881"/>
+        <w:gridCol w:w="1881"/>
+        <w:gridCol w:w="1881"/>
+      </w:tblGrid>
+      <w:tr>
+        <w:tc>
+          <w:tcPr>
+            <w:tcW w:type="dxa" w:w="1872"/>
+          </w:tcPr>
+          <w:p>
+            <w:pPr>
+              <w:jc w:val="center"/>
+            </w:pPr>
+            <w:r>
+              <w:rPr>
+                <w:b/>
+              </w:rPr>
+              <w:t>Split</w:t>
+            </w:r>
+          </w:p>
+        </w:tc>
+        <w:tc>
+          <w:tcPr>
+            <w:tcW w:type="dxa" w:w="1728"/>
+          </w:tcPr>
+          <w:p>
+            <w:pPr>
+              <w:jc w:val="center"/>
+            </w:pPr>
+            <w:r>
+              <w:rPr>
+                <w:b/>
+              </w:rPr>
+              <w:t>Sequences</w:t>
+            </w:r>
+          </w:p>
+        </w:tc>
+        <w:tc>
+          <w:tcPr>
+            <w:tcW w:type="dxa" w:w="1584"/>
+          </w:tcPr>
+          <w:p>
+            <w:pPr>
+              <w:jc w:val="center"/>
+            </w:pPr>
+            <w:r>
+              <w:rPr>
+                <w:b/>
+              </w:rPr>
+              <w:t>% of total</w:t>
+            </w:r>
+          </w:p>
+        </w:tc>
+        <w:tc>
+          <w:tcPr>
+            <w:tcW w:type="dxa" w:w="2160"/>
+          </w:tcPr>
+          <w:p>
+            <w:pPr>
+              <w:jc w:val="center"/>
+            </w:pPr>
+            <w:r>
+              <w:rPr>
+                <w:b/>
+              </w:rPr>
+              <w:t>Trajectory blocks</w:t>
+            </w:r>
+          </w:p>
+        </w:tc>
+        <w:tc>
+          <w:tcPr>
+            <w:tcW w:type="dxa" w:w="1728"/>
+          </w:tcPr>
+          <w:p>
+            <w:pPr>
+              <w:jc w:val="center"/>
+            </w:pPr>
+            <w:r>
+              <w:rPr>
+                <w:b/>
+              </w:rPr>
+              <w:t>% of blocks</w:t>
+            </w:r>
+          </w:p>
+        </w:tc>
+      </w:tr>
+      <w:tr>
+        <w:tc>
+          <w:tcPr>
+            <w:tcW w:type="dxa" w:w="1872"/>
+          </w:tcPr>
+          <w:p>
+            <w:pPr>
+              <w:jc w:val="center"/>
+            </w:pPr>
+            <w:r>
+              <w:t>Train</w:t>
+            </w:r>
+          </w:p>
+        </w:tc>
+        <w:tc>
+          <w:tcPr>
+            <w:tcW w:type="dxa" w:w="1728"/>
+          </w:tcPr>
+          <w:p>
+            <w:pPr>
+              <w:jc w:val="center"/>
+            </w:pPr>
+            <w:r>
+              <w:t>9,350</w:t>
+            </w:r>
+          </w:p>
+        </w:tc>
+        <w:tc>
+          <w:tcPr>
+            <w:tcW w:type="dxa" w:w="1584"/>
+          </w:tcPr>
+          <w:p>
+            <w:pPr>
+              <w:jc w:val="center"/>
+            </w:pPr>
+            <w:r>
+              <w:t>37.8%</w:t>
+            </w:r>
+          </w:p>
+        </w:tc>
+        <w:tc>
+          <w:tcPr>
+            <w:tcW w:type="dxa" w:w="2160"/>
+          </w:tcPr>
+          <w:p>
+            <w:pPr>
+              <w:jc w:val="center"/>
+            </w:pPr>
+            <w:r>
+              <w:t>10</w:t>
+            </w:r>
+          </w:p>
+        </w:tc>
+        <w:tc>
+          <w:tcPr>
+            <w:tcW w:type="dxa" w:w="1728"/>
+          </w:tcPr>
+          <w:p>
+            <w:pPr>
+              <w:jc w:val="center"/>
+            </w:pPr>
+            <w:r>
+              <w:t>52.6%</w:t>
+            </w:r>
+          </w:p>
+        </w:tc>
+      </w:tr>
+      <w:tr>
+        <w:tc>
+          <w:tcPr>
+            <w:tcW w:type="dxa" w:w="1872"/>
+          </w:tcPr>
+          <w:p>
+            <w:pPr>
+              <w:jc w:val="center"/>
+            </w:pPr>
+            <w:r>
+              <w:t>Validation</w:t>
+            </w:r>
+          </w:p>
+        </w:tc>
+        <w:tc>
+          <w:tcPr>
+            <w:tcW w:type="dxa" w:w="1728"/>
+          </w:tcPr>
+          <w:p>
+            <w:pPr>
+              <w:jc w:val="center"/>
+            </w:pPr>
+            <w:r>
+              <w:t>5,585</w:t>
+            </w:r>
+          </w:p>
+        </w:tc>
+        <w:tc>
+          <w:tcPr>
+            <w:tcW w:type="dxa" w:w="1584"/>
+          </w:tcPr>
+          <w:p>
+            <w:pPr>
+              <w:jc w:val="center"/>
+            </w:pPr>
+            <w:r>
+              <w:t>22.6%</w:t>
+            </w:r>
+          </w:p>
+        </w:tc>
+        <w:tc>
+          <w:tcPr>
+            <w:tcW w:type="dxa" w:w="2160"/>
+          </w:tcPr>
+          <w:p>
+            <w:pPr>
+              <w:jc w:val="center"/>
+            </w:pPr>
+            <w:r>
+              <w:t>3</w:t>
+            </w:r>
+          </w:p>
+        </w:tc>
+        <w:tc>
+          <w:tcPr>
+            <w:tcW w:type="dxa" w:w="1728"/>
+          </w:tcPr>
+          <w:p>
+            <w:pPr>
+              <w:jc w:val="center"/>
+            </w:pPr>
+            <w:r>
+              <w:t>15.8%</w:t>
+            </w:r>
+          </w:p>
+        </w:tc>
+      </w:tr>
+      <w:tr>
+        <w:tc>
+          <w:tcPr>
+            <w:tcW w:type="dxa" w:w="1872"/>
+          </w:tcPr>
+          <w:p>
+            <w:pPr>
+              <w:jc w:val="center"/>
+            </w:pPr>
+            <w:r>
+              <w:t>Calibration</w:t>
+            </w:r>
+          </w:p>
+        </w:tc>
+        <w:tc>
+          <w:tcPr>
+            <w:tcW w:type="dxa" w:w="1728"/>
+          </w:tcPr>
+          <w:p>
+            <w:pPr>
+              <w:jc w:val="center"/>
+            </w:pPr>
+            <w:r>
+              <w:t>3,385</w:t>
+            </w:r>
+          </w:p>
+        </w:tc>
+        <w:tc>
+          <w:tcPr>
+            <w:tcW w:type="dxa" w:w="1584"/>
+          </w:tcPr>
+          <w:p>
+            <w:pPr>
+              <w:jc w:val="center"/>
+            </w:pPr>
+            <w:r>
+              <w:t>13.7%</w:t>
+            </w:r>
+          </w:p>
+        </w:tc>
+        <w:tc>
+          <w:tcPr>
+            <w:tcW w:type="dxa" w:w="2160"/>
+          </w:tcPr>
+          <w:p>
+            <w:pPr>
+              <w:jc w:val="center"/>
+            </w:pPr>
+            <w:r>
+              <w:t>3</w:t>
+            </w:r>
+          </w:p>
+        </w:tc>
+        <w:tc>
+          <w:tcPr>
+            <w:tcW w:type="dxa" w:w="1728"/>
+          </w:tcPr>
+          <w:p>
+            <w:pPr>
+              <w:jc w:val="center"/>
+            </w:pPr>
+            <w:r>
+              <w:t>15.8%</w:t>
+            </w:r>
+          </w:p>
+        </w:tc>
+      </w:tr>
+      <w:tr>
+        <w:tc>
+          <w:tcPr>
+            <w:tcW w:type="dxa" w:w="1872"/>
+          </w:tcPr>
+          <w:p>
+            <w:pPr>
+              <w:jc w:val="center"/>
+            </w:pPr>
+            <w:r>
+              <w:t>Test</w:t>
+            </w:r>
+          </w:p>
+        </w:tc>
+        <w:tc>
+          <w:tcPr>
+            <w:tcW w:type="dxa" w:w="1728"/>
+          </w:tcPr>
+          <w:p>
+            <w:pPr>
+              <w:jc w:val="center"/>
+            </w:pPr>
+            <w:r>
+              <w:t>6,384</w:t>
+            </w:r>
+          </w:p>
+        </w:tc>
+        <w:tc>
+          <w:tcPr>
+            <w:tcW w:type="dxa" w:w="1584"/>
+          </w:tcPr>
+          <w:p>
+            <w:pPr>
+              <w:jc w:val="center"/>
+            </w:pPr>
+            <w:r>
+              <w:t>25.8%</w:t>
+            </w:r>
+          </w:p>
+        </w:tc>
+        <w:tc>
+          <w:tcPr>
+            <w:tcW w:type="dxa" w:w="2160"/>
+          </w:tcPr>
+          <w:p>
+            <w:pPr>
+              <w:jc w:val="center"/>
+            </w:pPr>
+            <w:r>
+              <w:t>3</w:t>
+            </w:r>
+          </w:p>
+        </w:tc>
+        <w:tc>
+          <w:tcPr>
+            <w:tcW w:type="dxa" w:w="1728"/>
+          </w:tcPr>
+          <w:p>
+            <w:pPr>
+              <w:jc w:val="center"/>
+            </w:pPr>
+            <w:r>
+              <w:t>15.8%</w:t>
+            </w:r>
+          </w:p>
+        </w:tc>
+      </w:tr>
+      <w:tr>
+        <w:tc>
+          <w:tcPr>
+            <w:tcW w:type="dxa" w:w="1872"/>
+          </w:tcPr>
+          <w:p>
+            <w:pPr>
+              <w:jc w:val="center"/>
+            </w:pPr>
+            <w:r>
+              <w:t>Total</w:t>
+            </w:r>
+          </w:p>
+        </w:tc>
+        <w:tc>
+          <w:tcPr>
+            <w:tcW w:type="dxa" w:w="1728"/>
+          </w:tcPr>
+          <w:p>
+            <w:pPr>
+              <w:jc w:val="center"/>
+            </w:pPr>
+            <w:r>
+              <w:t>24,704</w:t>
+            </w:r>
+          </w:p>
+        </w:tc>
+        <w:tc>
+          <w:tcPr>
+            <w:tcW w:type="dxa" w:w="1584"/>
+          </w:tcPr>
+          <w:p>
+            <w:pPr>
+              <w:jc w:val="center"/>
+            </w:pPr>
+            <w:r>
+              <w:t>100%</w:t>
+            </w:r>
+          </w:p>
+        </w:tc>
+        <w:tc>
+          <w:tcPr>
+            <w:tcW w:type="dxa" w:w="2160"/>
+          </w:tcPr>
+          <w:p>
+            <w:pPr>
+              <w:jc w:val="center"/>
+            </w:pPr>
+            <w:r>
+              <w:t>19</w:t>
+            </w:r>
+          </w:p>
+        </w:tc>
+        <w:tc>
+          <w:tcPr>
+            <w:tcW w:type="dxa" w:w="1728"/>
+          </w:tcPr>
+          <w:p>
+            <w:pPr>
+              <w:jc w:val="center"/>
+            </w:pPr>
+            <w:r>
+              <w:t>100%</w:t>
+            </w:r>
+          </w:p>
+        </w:tc>
+      </w:tr>
+    </w:tbl>
+    <w:p>
+      <w:pPr>
+        <w:jc w:val="center"/>
+      </w:pPr>
+      <w:r>
+        <w:rPr>
+          <w:i/>
+          <w:sz w:val="20"/>
+        </w:rPr>
+        <w:t>Table 2: Actual sample-level and block-level split distribution. The 55/15/15/15 ratio is by block count; sample percentages differ due to variable block lengths.</w:t>
+      </w:r>
+    </w:p>
+    <w:p/>
     <w:p>
       <w:pPr>
         <w:jc w:val="center"/>
@@ -667,7 +1188,7 @@
           <w:i/>
           <w:sz w:val="20"/>
         </w:rPr>
-        <w:t>Figure 3: Trajectory run length distribution.</w:t>
+        <w:t>Figure 3: Trajectory run length distribution. Runs vary from short segments to long drives, explaining the gap between block-level and sample-level split percentages.</w:t>
       </w:r>
     </w:p>
     <w:p>
@@ -718,7 +1239,7 @@
           <w:i/>
           <w:sz w:val="20"/>
         </w:rPr>
-        <w:t>Figure 4: Beam distribution per split. Test has different geometry — explains elevated majority baseline.</w:t>
+        <w:t>Figure 4: Beam class distribution per split. The test split has different beam geometry from training — explaining the elevated majority-class baseline on the test set.</w:t>
       </w:r>
     </w:p>
     <w:p>
@@ -735,7 +1256,7 @@
         <w:rPr>
           <w:b w:val="0"/>
         </w:rPr>
-        <w:t>9-dim feature per timestep: relative East/North, distance, sin/cos bearing, velocity E/N, speed, HDOP flag. Min-max scaler fitted on training only.</w:t>
+        <w:t>9-dimensional feature per timestep: relative East/North position (local ENU frame, Unit 1 as origin), Tx-Rx distance, sine/cosine of bearing, velocity East/North (finite differences), speed, and an HDOP quality flag (1 if HDOP &gt; 2 or NaN, else 0). A min-max scaler fitted on training data only is applied to all splits.</w:t>
       </w:r>
     </w:p>
     <w:p>
@@ -786,7 +1307,7 @@
           <w:i/>
           <w:sz w:val="20"/>
         </w:rPr>
-        <w:t>Figure 5: GPS exploration. Left: relative positions by beam. Centre: distance dist. Right: bearing dist.</w:t>
+        <w:t>Figure 5: GPS feature exploration. Left: Tx-Rx relative positions coloured by best beam. Centre: Tx-Rx distance distribution. Right: Bearing distribution.</w:t>
       </w:r>
     </w:p>
     <w:p>
@@ -803,7 +1324,7 @@
         <w:rPr>
           <w:b w:val="0"/>
         </w:rPr>
-        <w:t>96×96 px, cached as 686 MB RAM tensor. Training: ColorJitter ±10% brightness/contrast, same params applied to all 5 frames (temporal consistency). No horizontal flip (invalidates labels).</w:t>
+        <w:t>Front-camera frames resized to 96×96 px and cached as a unified uint8 RAM tensor (686 MB for 24,799 frames). Training augmentation: ColorJitter (brightness ±10%, contrast ±10%) with a single parameter draw per sequence applied identically to all 5 frames, preserving temporal consistency. Horizontal flips intentionally omitted — they would change the apparent Tx-Rx bearing and invalidate the GPS-derived beam-angle labels.</w:t>
       </w:r>
     </w:p>
     <w:p>
@@ -854,7 +1375,7 @@
           <w:i/>
           <w:sz w:val="20"/>
         </w:rPr>
-        <w:t>Figure 6: Sample RGB frames from Scenario 36.</w:t>
+        <w:t>Figure 6: Sample front-camera RGB frames from Scenario 36. Urban V2V driving scenes, Arizona.</w:t>
       </w:r>
     </w:p>
     <w:p/>
@@ -881,7 +1402,7 @@
         <w:rPr>
           <w:b w:val="0"/>
         </w:rPr>
-        <w:t>Power profiles are smooth and approximately unimodal over beam index — direct consequence of antenna geometry where adjacent beams point to similar angles. This motivates the smoothness penalty in P3's loss. Predicting 256 independent values without this constraint leads to noisy, non-physical profiles.</w:t>
+        <w:t>Power profiles are smooth and approximately unimodal over the 256 beam indices — a direct consequence of the physical antenna geometry where adjacent beams point to nearby angles. This structure is exploited by the smoothness penalty in P3's loss function. Predicting 256 independent values without this constraint risks noisy, non-physical profiles.</w:t>
       </w:r>
     </w:p>
     <w:p>
@@ -932,7 +1453,7 @@
           <w:i/>
           <w:sz w:val="20"/>
         </w:rPr>
-        <w:t>Figure 7: Left: Near-optimal set size histograms. Right: Sample 256-beam power profile — smooth angular structure.</w:t>
+        <w:t>Figure 7: Left: Near-optimal set size histograms (1 dB and 3 dB). Right: Sample 256-beam power profile showing smooth angular rolloff.</w:t>
       </w:r>
     </w:p>
     <w:p>
@@ -941,7 +1462,7 @@
         <w:jc w:val="left"/>
       </w:pPr>
       <w:r>
-        <w:t>3.2 Beam Distribution and Power Loss</w:t>
+        <w:t>3.2 Beam Distribution and Power Loss Analysis</w:t>
       </w:r>
     </w:p>
     <w:p>
@@ -992,7 +1513,7 @@
           <w:i/>
           <w:sz w:val="20"/>
         </w:rPr>
-        <w:t>Figure 8: Beam usage distribution. Heavy skew — small number of beams account for most samples.</w:t>
+        <w:t>Figure 8: Beam usage distribution. Heavy skew — a small number of beams account for most samples.</w:t>
       </w:r>
     </w:p>
     <w:p>
@@ -1000,7 +1521,7 @@
         <w:rPr>
           <w:b w:val="0"/>
         </w:rPr>
-        <w:t>APL distributions differ between splits, confirming geometric shift between training and test trajectories, which explains the high seed variance observed in test metrics.</w:t>
+        <w:t>Average Power Loss (APL) distributions differ between splits, confirming geometric shift between training and test trajectories. The test split's different APL profile explains the high seed-to-seed variance observed in test metrics.</w:t>
       </w:r>
     </w:p>
     <w:p>
@@ -1051,7 +1572,7 @@
           <w:i/>
           <w:sz w:val="20"/>
         </w:rPr>
-        <w:t>Figure 9: APL distribution by split. Test has different geometric characteristics from training.</w:t>
+        <w:t>Figure 9: APL distribution by split. Test split shows different geometric characteristics — a key source of seed variance in evaluation metrics.</w:t>
       </w:r>
     </w:p>
     <w:p>
@@ -1068,7 +1589,7 @@
         <w:rPr>
           <w:b w:val="0"/>
         </w:rPr>
-        <w:t>Accuracy degrades at larger distances and higher speeds — motivating temporal sequences (5 frames) over single-frame prediction.</w:t>
+        <w:t>Model accuracy degrades at larger Tx-Rx distances and higher vehicle speeds, motivating the use of 5-frame temporal sequences rather than single-frame prediction.</w:t>
       </w:r>
     </w:p>
     <w:p>
@@ -1119,7 +1640,7 @@
           <w:i/>
           <w:sz w:val="20"/>
         </w:rPr>
-        <w:t>Figure 10: Accuracy vs Tx-Rx distance (left) and estimated speed (right).</w:t>
+        <w:t>Figure 10: Accuracy vs Tx-Rx distance (left) and estimated vehicle speed (right). Both degrade with distance and speed — confirming the value of temporal context.</w:t>
       </w:r>
     </w:p>
     <w:p>
@@ -1179,7 +1700,7 @@
           <w:i/>
           <w:sz w:val="20"/>
         </w:rPr>
-        <w:t>Figure 11: Conformal candidate set size distribution. Variable sizes adapt to prediction confidence.</w:t>
+        <w:t>Figure 11: Conformal candidate set size distribution. Power-aware CRC threshold produces variable-size sets adapting to prediction confidence.</w:t>
       </w:r>
     </w:p>
     <w:p>
@@ -1187,7 +1708,7 @@
         <w:rPr>
           <w:b w:val="0"/>
         </w:rPr>
-        <w:t>P3 (MAE 2.49 dB, rank corr 0.237) occupies the low-MAE / positive-correlation quadrant. Classification-only models scatter with high MAE and near-zero correlation.</w:t>
+        <w:t>P3 (profile MAE 2.49 dB, rank correlation 0.237) occupies the low-MAE/positive-correlation quadrant. Classification-only models scatter with high MAE and near-zero rank correlation, confirming that profile supervision is essential for meaningful beam ordering.</w:t>
       </w:r>
     </w:p>
     <w:p>
@@ -1238,7 +1759,7 @@
           <w:i/>
           <w:sz w:val="20"/>
         </w:rPr>
-        <w:t>Figure 12: Profile MAE vs rank correlation. P3 uniquely achieves both low MAE and positive rank correlation.</w:t>
+        <w:t>Figure 12: Profile MAE vs rank correlation per model. P3 uniquely achieves both low MAE and positive rank correlation.</w:t>
       </w:r>
     </w:p>
     <w:p>
@@ -1349,7 +1870,7 @@
           <w:i/>
           <w:sz w:val="20"/>
         </w:rPr>
-        <w:t>Figure 14: Spatial error heatmap. Errors cluster at large distances and specific bearing angles.</w:t>
+        <w:t>Figure 14: Spatial prediction error heatmap. Errors cluster at large Tx-Rx distances and specific bearing angles.</w:t>
       </w:r>
     </w:p>
     <w:p>
@@ -1400,7 +1921,7 @@
           <w:i/>
           <w:sz w:val="20"/>
         </w:rPr>
-        <w:t>Figure 15: Multimodal performance breakdown by component.</w:t>
+        <w:t>Figure 15: Multimodal performance breakdown. Adding RGB gives the largest APL gain; profile supervision gives the largest MAE gain.</w:t>
       </w:r>
     </w:p>
     <w:p>
@@ -1437,7 +1958,7 @@
         <w:t xml:space="preserve">F2: </w:t>
       </w:r>
       <w:r>
-        <w:t>238/256 beams active, heavily skewed (beam #162 = 16.7%). Class-imbalance awareness is relevant.</w:t>
+        <w:t>238/256 beams active, heavily skewed (beam #162 = 16.7% of raw frames). Class imbalance is relevant for classification tasks.</w:t>
       </w:r>
     </w:p>
     <w:p>
@@ -1451,7 +1972,7 @@
         <w:t xml:space="preserve">F3: </w:t>
       </w:r>
       <w:r>
-        <w:t>Profiles are smooth and unimodal — justifying the smoothness penalty in P3.</w:t>
+        <w:t>Power profiles are smooth and approximately unimodal — justifying the smoothness penalty in P3's loss function.</w:t>
       </w:r>
     </w:p>
     <w:p>
@@ -1465,7 +1986,7 @@
         <w:t xml:space="preserve">F4: </w:t>
       </w:r>
       <w:r>
-        <w:t>Test geometry differs from training — inflates majority baseline and causes seed variance.</w:t>
+        <w:t>Test split has different beam geometry and APL distribution from training, inflating the majority-class baseline and causing high seed variance. This is a consequence of the trajectory-block split design, not a model failure.</w:t>
       </w:r>
     </w:p>
     <w:p>
@@ -1479,7 +2000,7 @@
         <w:t xml:space="preserve">F5: </w:t>
       </w:r>
       <w:r>
-        <w:t>Performance degrades with distance and speed — confirming value of 5-frame temporal context.</w:t>
+        <w:t>Performance degrades with Tx-Rx distance and vehicle speed — confirming the value of 5-frame temporal context over single-frame prediction.</w:t>
       </w:r>
     </w:p>
     <w:p/>
@@ -1492,6 +2013,19 @@
         <w:t>4. Literature Review</w:t>
       </w:r>
     </w:p>
+    <w:p>
+      <w:pPr>
+        <w:ind w:left="288"/>
+      </w:pPr>
+      <w:r>
+        <w:rPr>
+          <w:i/>
+          <w:sz w:val="18"/>
+        </w:rPr>
+        <w:t>Note: References [2], [8], [9], [10] use author names from the original research survey. These should be independently verified against Google Scholar before final submission, as exact author lists and venue details could not be fully confirmed at the time of writing.</w:t>
+      </w:r>
+    </w:p>
+    <w:p/>
     <w:p>
       <w:pPr>
         <w:pStyle w:val="Heading2"/>
@@ -1506,7 +2040,7 @@
         <w:rPr>
           <w:b w:val="0"/>
         </w:rPr>
-        <w:t>The DeepSense 6G challenge [1] introduced the Multi-Modal V2V Beam Prediction task, establishing synchronized RGB and GPS as viable sensing modalities. Official baselines show multi-modal inputs reduce beam training overhead but predict only the single best beam with no reliability guarantee. Jiang et al. [2] proposed a Multimodal Transformer fusing heterogeneous sensing via cross-attention, achieving strong Top-1 accuracy under static calibration but without online trajectory adaptation.</w:t>
+        <w:t>The DeepSense 6G challenge [1] introduced the Multi-Modal V2V Beam Prediction task and established synchronized RGB and GPS as viable sensing modalities for mmWave beam management. Official baselines show multi-modal inputs reduce beam training overhead versus channel sounding, but predict only the single best beam with no reliability guarantee. Jiang et al. [2]* proposed a Multimodal Transformer fusing heterogeneous sensing via cross-attention, achieving strong Top-1 accuracy under static calibration but without online trajectory adaptation.</w:t>
       </w:r>
     </w:p>
     <w:p>
@@ -1523,7 +2057,7 @@
         <w:rPr>
           <w:b w:val="0"/>
         </w:rPr>
-        <w:t>SCAN-BEST [3] applies conformal risk control (CRC) to predict a calibrated candidate beam subset with weighted calibration under covariate shift. It demonstrates reliable static miss-rate bounding but calibrates once at deployment time, predicts subset membership not a full power profile, and cannot adapt to trajectory drift. Our work predicts the complete profile and uses online ACI — a strictly harder and more practically relevant problem.</w:t>
+        <w:t>SCAN-BEST [3] applies conformal risk control to predict a calibrated candidate beam subset with weighted calibration under covariate shift. It demonstrates reliable static miss-rate bounding but calibrates a static threshold once at deployment, predicts subset membership rather than a full power profile, and cannot adapt to trajectory drift. This work predicts the complete power profile and uses online ACI — a strictly harder and more practically relevant problem.</w:t>
       </w:r>
     </w:p>
     <w:p>
@@ -1540,7 +2074,7 @@
         <w:rPr>
           <w:b w:val="0"/>
         </w:rPr>
-        <w:t>ACI by Gibbs and Candès [4] provides distribution-free long-run time-averaged risk control for streaming data via an integral controller. Conformal PID by Angelopoulos et al. [5] adds P and D terms for improved stability. Both are incorporated as Phase 7 online risk controllers. Note that the ACI time-averaged guarantee is distinct from split-conformal per-instance coverage — it applies to the running average of losses over a trajectory, not to any single prediction.</w:t>
+        <w:t>Adaptive Conformal Inference (ACI) by Gibbs and Candès [4] provides distribution-free long-run time-averaged risk control for streaming data via an integral controller. Conformal PID by Angelopoulos et al. [5] adds P and D terms for improved stability. Both are incorporated in this work as Phase 7 online risk controllers. The ACI time-averaged guarantee is distinct from split-conformal per-instance coverage — it applies to the running average of losses over a trajectory, not to any single prediction.</w:t>
       </w:r>
     </w:p>
     <w:p>
@@ -1557,7 +2091,7 @@
         <w:rPr>
           <w:b w:val="0"/>
         </w:rPr>
-        <w:t>CLBP [6] addresses cross-modal loss-tolerant beam prediction under degraded modalities via contrastive learning. AMBER [7] proposes adaptive masking for arbitrary modality dropout. Our HDOP quality flag provides lightweight GPS-degradation signaling; full masking strategies remain a future extension.</w:t>
+        <w:t>CLBP [6] addresses cross-modal loss-tolerant beam prediction under degraded modalities via contrastive learning. AMBER [7] proposes adaptive masking for arbitrary modality dropout. While this work does not explicitly model modality failure, the HDOP quality flag provides a lightweight GPS-degradation signal and the architecture is extensible with these strategies.</w:t>
       </w:r>
     </w:p>
     <w:p>
@@ -1574,7 +2108,7 @@
         <w:rPr>
           <w:b w:val="0"/>
         </w:rPr>
-        <w:t>Salehi et al. [8] propose sensing-assisted adaptive beam probing with calibrated multimodal priors and dB safety margins — sharing the goal of minimizing overhead while maintaining reliability. Our ACI controller complements this: rather than per-step scheduling, it maintains a running threshold satisfying the miss rate target on average over the trajectory.</w:t>
+        <w:t>Salehi et al. [8]* propose sensing-assisted adaptive beam probing with calibrated multimodal priors and dB safety margins — sharing the goal of minimizing probing overhead while maintaining reliability. Their approach focuses on per-step scheduling; our ACI controller instead maintains a running threshold satisfying the miss rate target on average over the full trajectory.</w:t>
       </w:r>
     </w:p>
     <w:p>
@@ -1591,7 +2125,7 @@
         <w:rPr>
           <w:b w:val="0"/>
         </w:rPr>
-        <w:t>Zhang et al. [9] propose a lightweight CNN-based beam tracker generalizing across environments — consistent with our ResNet-18 design (only layers 2–4 fine-tuned). Chen et al. [10] study multi-task learning for mmWave beam prediction with shared representations. P3 extends this with a physically-constrained profile head (smoothness + ranking losses) not present in prior work.</w:t>
+        <w:t>Zhang et al. [9]* propose a lightweight CNN-based beam tracker generalizing across environments, consistent with our ResNet-18 design where only layers 2–4 are fine-tuned. Chen et al. [10]* study multi-task learning for mmWave beam prediction with shared representations. P3 extends this with a physically-constrained profile head (smoothness + ranking losses) not present in prior multi-task beam work.</w:t>
       </w:r>
     </w:p>
     <w:p>
@@ -1687,7 +2221,7 @@
           <w:i/>
           <w:sz w:val="20"/>
         </w:rPr>
-        <w:t>Figure 20: End-to-End Pipeline — from raw data through preprocessing, feature extraction, P3 prediction, static CRC calibration, and online ACI risk control to the final candidate beam set (17 probes avg, 93% search reduction).</w:t>
+        <w:t>Figure 20: End-to-End Pipeline — raw data → preprocessing → feature extraction → P3 multi-task prediction → static CRC calibration → online ACI risk control → candidate beam set (17 probes avg, 93% search reduction).</w:t>
       </w:r>
     </w:p>
     <w:p/>
@@ -1717,7 +2251,7 @@
         <w:rPr>
           <w:b w:val="0"/>
         </w:rPr>
-        <w:t>5-frame clip reshaped to (B·5,3,96,96) → pretrained ResNet-18 (conv1+layer1 frozen, layers 2–4 fine-tuned) → linear projection 512→256 → reshape to (B,5,256) RGB tokens.</w:t>
+        <w:t>5-frame clip reshaped to (B·5, 3, 96, 96) → pretrained ResNet-18 (conv1+layer1 frozen, layers 2–4 fine-tuned) → linear projection 512→256 → reshape to (B, 5, 256) RGB tokens.</w:t>
       </w:r>
     </w:p>
     <w:p>
@@ -1737,7 +2271,7 @@
         <w:rPr>
           <w:b w:val="0"/>
         </w:rPr>
-        <w:t>3-layer Bidirectional GRU (hidden=256) on 9-dim sequence → project 512→256 → (B,5,256) GPS tokens.</w:t>
+        <w:t>3-layer Bidirectional GRU (hidden=256) on 9-dim sequence → project 512→256 → (B, 5, 256) GPS tokens.</w:t>
       </w:r>
     </w:p>
     <w:p>
@@ -1757,7 +2291,7 @@
         <w:rPr>
           <w:b w:val="0"/>
         </w:rPr>
-        <w:t>10-token sequence (5 GPS + 5 RGB) with modality and positional embeddings → 3-layer Pre-LN Transformer (8 heads, FFN=1024, dropout=0.12) → mean-pool → f ∈ R^(B×256).</w:t>
+        <w:t>10-token sequence (5 GPS + 5 RGB) with learnable modality and positional embeddings → 3-layer Pre-LN Transformer (8 heads, FFN=1024, dropout=0.12) → mean-pool → f ∈ R^(B×256).</w:t>
       </w:r>
     </w:p>
     <w:p>
@@ -1779,7 +2313,7 @@
         </w:rPr>
         <w:t>cls_head(f): Linear→GELU→Dropout→Linear → 256-class beam logits.</w:t>
         <w:br/>
-        <w:t>profile_head(f): same MLP → 256-value power-gap profile.</w:t>
+        <w:t>profile_head(f): same MLP structure → 256-value power-gap profile.</w:t>
       </w:r>
     </w:p>
     <w:p/>
@@ -1831,7 +2365,7 @@
           <w:i/>
           <w:sz w:val="20"/>
         </w:rPr>
-        <w:t>Figure 21: P3 Model Architecture — ResNet-18 visual encoder + BiGRU GPS encoder + Pre-LN Transformer fusion + dual classification and profile heads with multi-task loss.</w:t>
+        <w:t>Figure 21: P3 Model Architecture — ResNet-18 + BiGRU + Pre-LN Transformer + dual classification and profile heads with multi-task loss.</w:t>
       </w:r>
     </w:p>
     <w:p/>
@@ -1857,7 +2391,7 @@
         <w:pStyle w:val="ListBullet"/>
       </w:pPr>
       <w:r>
-        <w:t>L_CE: Cross-entropy on beam classification.</w:t>
+        <w:t>L_CE: Cross-entropy on 256-class beam classification.</w:t>
       </w:r>
     </w:p>
     <w:p>
@@ -1865,7 +2399,7 @@
         <w:pStyle w:val="ListBullet"/>
       </w:pPr>
       <w:r>
-        <w:t>L_prof: MSE on 256-value power-gap profile.</w:t>
+        <w:t>L_prof: MSE on the 256-value power-gap profile.</w:t>
       </w:r>
     </w:p>
     <w:p>
@@ -1873,7 +2407,7 @@
         <w:pStyle w:val="ListBullet"/>
       </w:pPr>
       <w:r>
-        <w:t>L_smooth: Mean squared first-difference over beam indices — exploits physical angular smoothness.</w:t>
+        <w:t>L_smooth: Mean squared first-difference over adjacent beam indices — exploits physical angular smoothness of the beam power landscape.</w:t>
       </w:r>
     </w:p>
     <w:p>
@@ -1881,7 +2415,7 @@
         <w:pStyle w:val="ListBullet"/>
       </w:pPr>
       <w:r>
-        <w:t>L_rank: Pairwise hinge ranking — beam ordering in predictions must match measured power order.</w:t>
+        <w:t>L_rank: Pairwise hinge ranking loss — beam power ordering in predictions should match the measured ordering.</w:t>
       </w:r>
     </w:p>
     <w:p>
@@ -1976,7 +2510,7 @@
               <w:jc w:val="center"/>
             </w:pPr>
             <w:r>
-              <w:t>Peak LR</w:t>
+              <w:t>Peak learning rate</w:t>
             </w:r>
           </w:p>
         </w:tc>
@@ -1989,7 +2523,7 @@
               <w:jc w:val="center"/>
             </w:pPr>
             <w:r>
-              <w:t>1×10⁻⁴</w:t>
+              <w:t>1 × 10⁻⁴</w:t>
             </w:r>
           </w:p>
         </w:tc>
@@ -2017,7 +2551,7 @@
               <w:jc w:val="center"/>
             </w:pPr>
             <w:r>
-              <w:t>3×10⁻⁴</w:t>
+              <w:t>3 × 10⁻⁴</w:t>
             </w:r>
           </w:p>
         </w:tc>
@@ -2045,7 +2579,7 @@
               <w:jc w:val="center"/>
             </w:pPr>
             <w:r>
-              <w:t>OneCycleLR (cosine, 10% warmup)</w:t>
+              <w:t>OneCycleLR (cosine annealing, 10% warmup)</w:t>
             </w:r>
           </w:p>
         </w:tc>
@@ -2101,7 +2635,7 @@
               <w:jc w:val="center"/>
             </w:pPr>
             <w:r>
-              <w:t>80 (patience=15, min=40)</w:t>
+              <w:t>80 (early stopping: patience=15, min=40)</w:t>
             </w:r>
           </w:p>
         </w:tc>
@@ -2129,7 +2663,7 @@
               <w:jc w:val="center"/>
             </w:pPr>
             <w:r>
-              <w:t>BFloat16 (CUDA)</w:t>
+              <w:t>BFloat16 on CUDA</w:t>
             </w:r>
           </w:p>
         </w:tc>
@@ -2144,7 +2678,7 @@
               <w:jc w:val="center"/>
             </w:pPr>
             <w:r>
-              <w:t>Seeds</w:t>
+              <w:t>Random seeds</w:t>
             </w:r>
           </w:p>
         </w:tc>
@@ -2157,7 +2691,7 @@
               <w:jc w:val="center"/>
             </w:pPr>
             <w:r>
-              <w:t>42, 7, 13</w:t>
+              <w:t>42, 7, 13 (3 seeds)</w:t>
             </w:r>
           </w:p>
         </w:tc>
@@ -2185,7 +2719,7 @@
               <w:jc w:val="center"/>
             </w:pPr>
             <w:r>
-              <w:t>RTX 4060 8 GB</w:t>
+              <w:t>NVIDIA GeForce RTX 4060 (8 GB VRAM)</w:t>
             </w:r>
           </w:p>
         </w:tc>
@@ -2200,7 +2734,7 @@
           <w:i/>
           <w:sz w:val="20"/>
         </w:rPr>
-        <w:t>Table 2: Training hyperparameters.</w:t>
+        <w:t>Table 3: Training hyperparameters.</w:t>
       </w:r>
     </w:p>
     <w:p/>
@@ -2218,7 +2752,7 @@
         <w:rPr>
           <w:b w:val="0"/>
         </w:rPr>
-        <w:t>Static CRC: calibrate q on 3,385 calibration sequences — smallest q satisfying (n/(n+1))-adjusted empirical risk ≤ α=0.10. q_max = 99th-percentile calibration gap = 35.5 dB.</w:t>
+        <w:t>Static Power CRC: calibrate q on 3,385 calibration sequences — select the smallest q satisfying the (n/(n+1))-adjusted empirical risk ≤ α = 0.10. q_max = 99th-percentile calibration gap = 35.5 dB (data-driven upper bound).</w:t>
       </w:r>
     </w:p>
     <w:p>
@@ -2226,7 +2760,7 @@
         <w:rPr>
           <w:b/>
         </w:rPr>
-        <w:t>Online ACI update (after each observed outcome):</w:t>
+        <w:t>Online ACI update rule (after each observed outcome):</w:t>
       </w:r>
     </w:p>
     <w:p>
@@ -2234,7 +2768,7 @@
         <w:rPr>
           <w:b/>
         </w:rPr>
-        <w:t>q_{t+1} = clip(q_t + η(ℓ_t − α),  0 dB,  35.5 dB)</w:t>
+        <w:t>q_{t+1} = clip( q_t + η(ℓ_t − α),  0 dB,  35.5 dB )</w:t>
       </w:r>
     </w:p>
     <w:p>
@@ -2242,7 +2776,7 @@
         <w:rPr>
           <w:b w:val="0"/>
         </w:rPr>
-        <w:t>where ℓ_t=1 if miss, else 0. η=0.1 selected on validation only. Warm-started with static CRC q. The ACI long-run time-averaged guarantee is distinct from per-instance coverage: it applies to the running average of losses over the trajectory, not to any single prediction.</w:t>
+        <w:t>where ℓ_t = 1 if the candidate set misses the 3 dB near-optimal beam, else 0. η = 0.1 selected by grid search on the validation split only (not the test stream). Warm-started from the static CRC threshold. The ACI long-run time-averaged guarantee is distinct from per-instance split-conformal coverage: it applies to the running average of losses over the trajectory, not to any individual prediction.</w:t>
       </w:r>
     </w:p>
     <w:p>
@@ -2339,7 +2873,7 @@
               <w:jc w:val="center"/>
             </w:pPr>
             <w:r>
-              <w:t>Geometric (bearing→codebook)</w:t>
+              <w:t>Geometric (bearing→beam codebook)</w:t>
             </w:r>
           </w:p>
         </w:tc>
@@ -2380,7 +2914,7 @@
               <w:jc w:val="center"/>
             </w:pPr>
             <w:r>
-              <w:t>BiGRU on GPS</w:t>
+              <w:t>BiGRU on GPS sequence</w:t>
             </w:r>
           </w:p>
         </w:tc>
@@ -2421,7 +2955,7 @@
               <w:jc w:val="center"/>
             </w:pPr>
             <w:r>
-              <w:t>ResNet-18+BiGRU+Gated Fusion</w:t>
+              <w:t>ResNet-18 + BiGRU + Gated Concat Fusion</w:t>
             </w:r>
           </w:p>
         </w:tc>
@@ -2462,7 +2996,7 @@
               <w:jc w:val="center"/>
             </w:pPr>
             <w:r>
-              <w:t>ResNet-18+BiGRU+Pre-LN Transformer</w:t>
+              <w:t>ResNet-18 + BiGRU + Pre-LN Transformer</w:t>
             </w:r>
           </w:p>
         </w:tc>
@@ -2503,7 +3037,7 @@
               <w:jc w:val="center"/>
             </w:pPr>
             <w:r>
-              <w:t>ResNet-18+BiGRU+Pre-LN Transformer</w:t>
+              <w:t>ResNet-18 + BiGRU + Pre-LN Transformer</w:t>
             </w:r>
           </w:p>
         </w:tc>
@@ -2516,7 +3050,7 @@
               <w:jc w:val="center"/>
             </w:pPr>
             <w:r>
-              <w:t>Class + Profile</w:t>
+              <w:t>Classification + Profile</w:t>
             </w:r>
           </w:p>
         </w:tc>
@@ -2531,7 +3065,7 @@
           <w:i/>
           <w:sz w:val="20"/>
         </w:rPr>
-        <w:t>Table 3: Model variants.</w:t>
+        <w:t>Table 4: Model variants used in the ablation study.</w:t>
       </w:r>
     </w:p>
     <w:p/>
@@ -2558,7 +3092,7 @@
         <w:rPr>
           <w:b w:val="0"/>
         </w:rPr>
-        <w:t>Table 4: seed-42 best checkpoint. Majority baseline = 20.41% Top-1; mean-profile floor = 3.107 dB.</w:t>
+        <w:t>Seed-42 best checkpoint. Majority baseline = 20.41% Top-1 (test sequences). Mean-profile MAE floor = 3.107 dB.</w:t>
       </w:r>
     </w:p>
     <w:tbl>
@@ -2794,7 +3328,7 @@
               <w:jc w:val="center"/>
             </w:pPr>
             <w:r>
-              <w:t>B1 (GPS)</w:t>
+              <w:t>B1 (GPS-only)</w:t>
             </w:r>
           </w:p>
         </w:tc>
@@ -2887,7 +3421,7 @@
               <w:jc w:val="center"/>
             </w:pPr>
             <w:r>
-              <w:t>B3 (fusion)</w:t>
+              <w:t>B3 (RGB+GPS)</w:t>
             </w:r>
           </w:p>
         </w:tc>
@@ -2980,7 +3514,7 @@
               <w:jc w:val="center"/>
             </w:pPr>
             <w:r>
-              <w:t>P1 (class)</w:t>
+              <w:t>P1 (class-only)</w:t>
             </w:r>
           </w:p>
         </w:tc>
@@ -3166,7 +3700,7 @@
               <w:jc w:val="center"/>
             </w:pPr>
             <w:r>
-              <w:t>Majority</w:t>
+              <w:t>Majority baseline</w:t>
             </w:r>
           </w:p>
         </w:tc>
@@ -3259,7 +3793,7 @@
               <w:jc w:val="center"/>
             </w:pPr>
             <w:r>
-              <w:t>Mean-prof floor</w:t>
+              <w:t>Mean-profile floor</w:t>
             </w:r>
           </w:p>
         </w:tc>
@@ -3352,7 +3886,7 @@
           <w:i/>
           <w:sz w:val="20"/>
         </w:rPr>
-        <w:t>Table 4: Model comparison (seed 42). ✓ = beats mean-profile floor. Note: 3-seed mean P3 Top-5 = 32.8% due to test-set geometry shift across seeds.</w:t>
+        <w:t>Table 5: Model comparison (seed 42 best checkpoint). ✓ = beats mean-profile floor. 3-seed mean P3 Top-5 = 32.8% (range 20.3%–46.8%) due to test-set geometry shift.</w:t>
       </w:r>
     </w:p>
     <w:p/>
@@ -3413,7 +3947,7 @@
         <w:jc w:val="left"/>
       </w:pPr>
       <w:r>
-        <w:t>6.2 Why Top-1 &lt; Majority Baseline</w:t>
+        <w:t>6.2 Why Top-1 Falls Below the Majority Baseline</w:t>
       </w:r>
     </w:p>
     <w:p>
@@ -3421,7 +3955,7 @@
         <w:rPr>
           <w:b w:val="0"/>
         </w:rPr>
-        <w:t>All models fall below the 20.41% majority-class Top-1. The test split has 3 blocks with different road geometry from training — beam #162 (dominant in training) is less frequent in test routes, inflating the majority baseline. Top-5 and APL are the correct primary metrics for a candidate-set project. P3 Top-5 = 46.8% (3.1× B1) and APL = 10.17 dB (4 dB better than B1).</w:t>
+        <w:t>All trained models fall below the 20.41% majority-class Top-1. This is expected and is a consequence of the trajectory-block split design: the 3 test blocks have different spatial geometry from the 10 training blocks. Beam #162 dominates training routes but is less frequent in test routes, inflating the majority baseline specifically for the test split. For a candidate-set project, Top-5 and APL are the correct primary metrics. P3 achieves Top-5 = 46.8% (3.1× B1's 15.3%) and APL = 10.17 dB (4 dB better than B1's 14.17 dB).</w:t>
       </w:r>
     </w:p>
     <w:p>
@@ -3438,7 +3972,7 @@
         <w:rPr>
           <w:b w:val="0"/>
         </w:rPr>
-        <w:t>P3 profile MAE = 2.487 dB, below the mean-profile floor of 3.107 dB — P3 genuinely learns the input-dependent beam landscape. The 14.5× MAE reduction from P1 (35.99 dB) directly answers RQ1. Rank correlation 0.237 (vs ≈0 for classification-only) confirms P3 correctly orders beams by power.</w:t>
+        <w:t>P3 achieves profile MAE = 2.487 dB, below the mean-profile floor of 3.107 dB. This confirms that P3 genuinely learns the input-dependent beam power landscape rather than memorizing the training mean. The 14.5× MAE reduction from P1 (35.99 dB) to P3 (2.49 dB) directly answers RQ1: full power-profile supervision significantly improves candidate-set quality. The Spearman rank correlation of 0.237 for P3 (versus ≈0 for all classification-only models) confirms that P3 correctly orders beams by predicted power — the property required for accurate threshold-based candidate-set construction.</w:t>
       </w:r>
     </w:p>
     <w:p>
@@ -3448,6 +3982,14 @@
       </w:pPr>
       <w:r>
         <w:t>6.4 Candidate Set Results</w:t>
+      </w:r>
+    </w:p>
+    <w:p>
+      <w:r>
+        <w:rPr>
+          <w:b w:val="0"/>
+        </w:rPr>
+        <w:t>Table 6 presents results for fixed Top-k sets and power-aware threshold controllers. Note: the Exact-label CRC row uses a different miss criterion (Δ=0 dB exact-beam miss) and is therefore not directly comparable to the Δ=3 dB miss rates of all other rows.</w:t>
       </w:r>
     </w:p>
     <w:tbl>
@@ -3509,7 +4051,7 @@
               <w:rPr>
                 <w:b/>
               </w:rPr>
-              <w:t>Miss @3dB (%)</w:t>
+              <w:t>Miss @3 dB (%)</w:t>
             </w:r>
           </w:p>
         </w:tc>
@@ -4082,73 +4624,6 @@
           </w:p>
         </w:tc>
       </w:tr>
-      <w:tr>
-        <w:tc>
-          <w:tcPr>
-            <w:tcW w:type="dxa" w:w="2160"/>
-          </w:tcPr>
-          <w:p>
-            <w:pPr>
-              <w:jc w:val="center"/>
-            </w:pPr>
-            <w:r>
-              <w:t>Exact-label CRC</w:t>
-            </w:r>
-          </w:p>
-        </w:tc>
-        <w:tc>
-          <w:tcPr>
-            <w:tcW w:type="dxa" w:w="1728"/>
-          </w:tcPr>
-          <w:p>
-            <w:pPr>
-              <w:jc w:val="center"/>
-            </w:pPr>
-            <w:r>
-              <w:t>95.6</w:t>
-            </w:r>
-          </w:p>
-        </w:tc>
-        <w:tc>
-          <w:tcPr>
-            <w:tcW w:type="dxa" w:w="1728"/>
-          </w:tcPr>
-          <w:p>
-            <w:pPr>
-              <w:jc w:val="center"/>
-            </w:pPr>
-            <w:r>
-              <w:t>4.4 ✓</w:t>
-            </w:r>
-          </w:p>
-        </w:tc>
-        <w:tc>
-          <w:tcPr>
-            <w:tcW w:type="dxa" w:w="1440"/>
-          </w:tcPr>
-          <w:p>
-            <w:pPr>
-              <w:jc w:val="center"/>
-            </w:pPr>
-            <w:r>
-              <w:t>168</w:t>
-            </w:r>
-          </w:p>
-        </w:tc>
-        <w:tc>
-          <w:tcPr>
-            <w:tcW w:type="dxa" w:w="1872"/>
-          </w:tcPr>
-          <w:p>
-            <w:pPr>
-              <w:jc w:val="center"/>
-            </w:pPr>
-            <w:r>
-              <w:t>34.4</w:t>
-            </w:r>
-          </w:p>
-        </w:tc>
-      </w:tr>
     </w:tbl>
     <w:p>
       <w:pPr>
@@ -4159,7 +4634,20 @@
           <w:i/>
           <w:sz w:val="20"/>
         </w:rPr>
-        <w:t>Table 5: Candidate set results. Target α = 0.10. ✓ = satisfies target.</w:t>
+        <w:t>Table 6: Candidate set results (Δ=3 dB criterion). Target α = 0.10. ✓ = satisfies target.</w:t>
+      </w:r>
+    </w:p>
+    <w:p/>
+    <w:p>
+      <w:pPr>
+        <w:ind w:left="288"/>
+      </w:pPr>
+      <w:r>
+        <w:rPr>
+          <w:i/>
+          <w:sz w:val="18"/>
+        </w:rPr>
+        <w:t>Note: Exact-label CRC is reported separately: coverage = 95.6% (1 − coverage = 4.4% exact-beam miss at Δ=0 dB), average set size = 168.3, search reduction = 34.2%. This Δ=0 miss rate is not comparable to the Δ=3 dB column above.</w:t>
       </w:r>
     </w:p>
     <w:p/>
@@ -4211,7 +4699,7 @@
           <w:i/>
           <w:sz w:val="20"/>
         </w:rPr>
-        <w:t>Figure 17: Left: Miss rate vs k. Centre: Exact inclusion vs k. Right: Pareto front — ACI achieves best efficiency.</w:t>
+        <w:t>Figure 17: Left: 3 dB miss rate vs k. Centre: Exact inclusion vs k. Right: Pareto front (probes vs miss rate) — ACI achieves the best probe efficiency.</w:t>
       </w:r>
     </w:p>
     <w:p>
@@ -4228,7 +4716,7 @@
         <w:rPr>
           <w:b w:val="0"/>
         </w:rPr>
-        <w:t>All three controllers satisfy the 10% miss rate target. ACI is most probe-efficient: 7.5% miss at 17 probes (93.3% search reduction). Reliability curves show both controllers tracking the target throughout the test stream.</w:t>
+        <w:t>All three power-aware controllers satisfy the 10% miss rate target. ACI is the most probe-efficient: 7.5% miss at only 17 probes (93.3% search reduction vs 256-beam scan), with APL = 1.08 dB confirming that the 17-probe candidate sets contain beams very close to optimal on average. The Conformal PID achieves a lower miss rate (8.6%) but at 49 probes — nearly 3× ACI's probe count. Static Power CRC achieves the lowest miss rate (4.6%) but uses 32 probes and cannot adapt to trajectory drift.</w:t>
       </w:r>
     </w:p>
     <w:p>
@@ -4279,7 +4767,7 @@
           <w:i/>
           <w:sz w:val="20"/>
         </w:rPr>
-        <w:t>Figure 18: Rolling miss rate (100-step window) for ACI and Conformal PID. Both track the 10% target.</w:t>
+        <w:t>Figure 18: Rolling miss rate (100-step window) for ACI and Conformal PID throughout the test stream. Both track the 10% target; ACI adapts faster after regime changes.</w:t>
       </w:r>
     </w:p>
     <w:p>
@@ -4330,7 +4818,7 @@
           <w:i/>
           <w:sz w:val="20"/>
         </w:rPr>
-        <w:t>Figure 19: Top-5 coverage at 0/1/3 dB thresholds. 83.6% coverage within 3 dB with only 5 probes.</w:t>
+        <w:t>Figure 19: Top-5 coverage at 0 dB, 1 dB, and 3 dB near-optimal thresholds. 83.6% coverage within 3 dB with only 5 probes.</w:t>
       </w:r>
     </w:p>
     <w:p>
@@ -4347,7 +4835,7 @@
         <w:rPr>
           <w:b w:val="0"/>
         </w:rPr>
-        <w:t>Paired trajectory-block bootstrap (n_boot=300, whole trajectory blocks resampled — not frames): P3 significantly outperforms P1 — mean +6.35%, 95% CI [+1.38%, +8.18%]. CI excludes zero: significant at the 5% level. Frame-level bootstrap was deliberately avoided as it understates variance by breaking temporal autocorrelation within trajectories.</w:t>
+        <w:t>Paired trajectory-block bootstrap (n_boot=300): complete trajectory blocks are resampled with replacement — not individual frames — to correctly account for temporal autocorrelation within trajectories. Frame-level bootstrap would understate variance because consecutive frames in a trajectory are correlated. Result: P3 significantly outperforms P1 — mean difference +6.35%, 95% CI [+1.38%, +8.18%]. The CI excludes zero, confirming significance at the 5% level.</w:t>
       </w:r>
     </w:p>
     <w:p>
@@ -4391,7 +4879,7 @@
         </w:tc>
         <w:tc>
           <w:tcPr>
-            <w:tcW w:type="dxa" w:w="2592"/>
+            <w:tcW w:type="dxa" w:w="2736"/>
           </w:tcPr>
           <w:p>
             <w:pPr>
@@ -4423,7 +4911,7 @@
         </w:tc>
         <w:tc>
           <w:tcPr>
-            <w:tcW w:type="dxa" w:w="2448"/>
+            <w:tcW w:type="dxa" w:w="2304"/>
           </w:tcPr>
           <w:p>
             <w:pPr>
@@ -4433,7 +4921,7 @@
               <w:rPr>
                 <w:b/>
               </w:rPr>
-              <w:t>APL Effect</w:t>
+              <w:t>Key Metric Effect</w:t>
             </w:r>
           </w:p>
         </w:tc>
@@ -4448,20 +4936,20 @@
               <w:jc w:val="center"/>
             </w:pPr>
             <w:r>
-              <w:t>B1→B3</w:t>
+              <w:t>B1 → B3</w:t>
             </w:r>
           </w:p>
         </w:tc>
         <w:tc>
           <w:tcPr>
-            <w:tcW w:type="dxa" w:w="2592"/>
+            <w:tcW w:type="dxa" w:w="2736"/>
           </w:tcPr>
           <w:p>
             <w:pPr>
               <w:jc w:val="center"/>
             </w:pPr>
             <w:r>
-              <w:t>+RGB (Gated Fusion)</w:t>
+              <w:t>+RGB modality (Gated Fusion)</w:t>
             </w:r>
           </w:p>
         </w:tc>
@@ -4480,14 +4968,14 @@
         </w:tc>
         <w:tc>
           <w:tcPr>
-            <w:tcW w:type="dxa" w:w="2448"/>
+            <w:tcW w:type="dxa" w:w="2304"/>
           </w:tcPr>
           <w:p>
             <w:pPr>
               <w:jc w:val="center"/>
             </w:pPr>
             <w:r>
-              <w:t>14.17→7.29 dB (−6.9 dB)</w:t>
+              <w:t>APL: 14.17→7.29 dB (−6.9 dB)</w:t>
             </w:r>
           </w:p>
         </w:tc>
@@ -4502,13 +4990,13 @@
               <w:jc w:val="center"/>
             </w:pPr>
             <w:r>
-              <w:t>B3→P1</w:t>
+              <w:t>B3 → P1</w:t>
             </w:r>
           </w:p>
         </w:tc>
         <w:tc>
           <w:tcPr>
-            <w:tcW w:type="dxa" w:w="2592"/>
+            <w:tcW w:type="dxa" w:w="2736"/>
           </w:tcPr>
           <w:p>
             <w:pPr>
@@ -4534,14 +5022,14 @@
         </w:tc>
         <w:tc>
           <w:tcPr>
-            <w:tcW w:type="dxa" w:w="2448"/>
+            <w:tcW w:type="dxa" w:w="2304"/>
           </w:tcPr>
           <w:p>
             <w:pPr>
               <w:jc w:val="center"/>
             </w:pPr>
             <w:r>
-              <w:t>7.29→12.33 dB (test shift*)</w:t>
+              <w:t>APL shift due to test geometry</w:t>
             </w:r>
           </w:p>
         </w:tc>
@@ -4556,20 +5044,20 @@
               <w:jc w:val="center"/>
             </w:pPr>
             <w:r>
-              <w:t>P1→P3</w:t>
+              <w:t>P1 → P3</w:t>
             </w:r>
           </w:p>
         </w:tc>
         <w:tc>
           <w:tcPr>
-            <w:tcW w:type="dxa" w:w="2592"/>
+            <w:tcW w:type="dxa" w:w="2736"/>
           </w:tcPr>
           <w:p>
             <w:pPr>
               <w:jc w:val="center"/>
             </w:pPr>
             <w:r>
-              <w:t>+Profile supervision</w:t>
+              <w:t>+Profile supervision (multi-task)</w:t>
             </w:r>
           </w:p>
         </w:tc>
@@ -4588,14 +5076,14 @@
         </w:tc>
         <w:tc>
           <w:tcPr>
-            <w:tcW w:type="dxa" w:w="2448"/>
+            <w:tcW w:type="dxa" w:w="2304"/>
           </w:tcPr>
           <w:p>
             <w:pPr>
               <w:jc w:val="center"/>
             </w:pPr>
             <w:r>
-              <w:t>Profile MAE: 36→2.49 dB</w:t>
+              <w:t>Profile MAE: 35.99→2.49 dB</w:t>
             </w:r>
           </w:p>
         </w:tc>
@@ -4610,7 +5098,7 @@
           <w:i/>
           <w:sz w:val="20"/>
         </w:rPr>
-        <w:t>Table 6: Ablation study. *B3→P1 APL increase reflects test-set geometry shift, not regression.</w:t>
+        <w:t>Table 7: Ablation study — contribution of each architectural component.</w:t>
       </w:r>
     </w:p>
     <w:p/>
@@ -4634,7 +5122,7 @@
         <w:t xml:space="preserve">Issue 1: </w:t>
       </w:r>
       <w:r>
-        <w:t>Test geometry shift: 3 test blocks differ from training → P3 Top-5 seed range 20.3%–46.8%. Data-size limitation, not model failure.</w:t>
+        <w:t>Test geometry shift: 3 test blocks differ from training, causing P3 Top-5 seed range 20.3%–46.8%. This is a data-size limitation inherent to the trajectory-block split design, not a model failure. Always report with CI.</w:t>
       </w:r>
     </w:p>
     <w:p>
@@ -4648,7 +5136,7 @@
         <w:t xml:space="preserve">Issue 2: </w:t>
       </w:r>
       <w:r>
-        <w:t>Rare beams: profile head over-predicts gaps for beams far from optimal (rare in training). Smoothness penalty partially mitigates this.</w:t>
+        <w:t>Rare beams: profile head tends to over-predict gaps for beams far from the current optimal, as extreme-gap samples are rare in training. The smoothness penalty partially mitigates this.</w:t>
       </w:r>
     </w:p>
     <w:p>
@@ -4662,7 +5150,7 @@
         <w:t xml:space="preserve">Issue 3: </w:t>
       </w:r>
       <w:r>
-        <w:t>Seed 13 early stopping: stopped at epoch 22 with lower val accuracy → pulls down the 3-seed mean (32.8%) vs best-seed (46.8%).</w:t>
+        <w:t>P3 seed 13 early stopping: stopped at epoch 22 with lower validation accuracy (18.25%) than seeds 42 (21.3%) and 7 (26.8%), pulling the 3-seed mean Top-5 (32.8%) below the best-seed result (46.8%). This reflects genuine sensitivity to random initialization when the validation set has only 3 trajectory blocks.</w:t>
       </w:r>
     </w:p>
     <w:p/>
@@ -4689,7 +5177,7 @@
         <w:rPr>
           <w:b w:val="0"/>
         </w:rPr>
-        <w:t>This work proposed P3, a multi-task model predicting the complete 256-beam power-gap profile from temporal RGB+GPS, and ACI, an online risk controller maintaining a near-optimal-beam miss rate target during deployment. On DeepSense 6G Scenario 36: P3 profile MAE 2.49 dB (below floor 3.11 dB), Top-5 46.8% (3.1× GPS-only), APL 10.17 dB (−4.0 dB vs B1), ACI 7.5% miss at 17 probes (93% search reduction). Paired bootstrap: +6.35% CI [+1.38%, +8.18%], significant. RQ1: profile supervision improves candidate-set quality (14.5× MAE reduction). RQ2: online ACI outperforms static CRC with fewer probes. RQ3: RGB+GPS outperforms GPS-only by 4 dB APL.</w:t>
+        <w:t>This work proposed P3, a multi-task model predicting the complete 256-beam power-gap profile from temporal RGB+GPS observations, and ACI, an online trajectory-adaptive risk controller. Evaluated on DeepSense 6G Scenario 36 (9,350 training sequences across 10 trajectory blocks): P3 profile MAE = 2.49 dB (below the 3.11 dB mean-profile floor), Top-5 = 46.8% (3.1× GPS-only), APL = 10.17 dB (4.0 dB better than GPS-only). ACI achieves 7.5% miss at 17 probes (93% search reduction). Paired trajectory-block bootstrap: P3 vs P1 +6.35%, CI [+1.38%, +8.18%], statistically significant. RQ1 answered: profile supervision improves candidate-set quality (14.5× MAE reduction). RQ2 answered: online ACI outperforms static CRC with fewer probes. RQ3 answered: RGB+GPS outperforms GPS-only by 4 dB APL.</w:t>
       </w:r>
     </w:p>
     <w:p>
@@ -4706,7 +5194,7 @@
         <w:pStyle w:val="ListBullet"/>
       </w:pPr>
       <w:r>
-        <w:t>Scenario 36 only (24,799 samples). Full evaluation across Scenarios 36–39 (~112,000 samples) needed.</w:t>
+        <w:t>Scenario 36 only (9,350 training sequences). Full evaluation across Scenarios 36–39 (~112,000 samples) needed for stronger generalization claims.</w:t>
       </w:r>
     </w:p>
     <w:p>
@@ -4714,7 +5202,7 @@
         <w:pStyle w:val="ListBullet"/>
       </w:pPr>
       <w:r>
-        <w:t>Small test set (3 blocks) causes high seed variance — report CIs, not just means.</w:t>
+        <w:t>Small test set (3 trajectory blocks, 6,384 sequences) causes high seed variance. Always report CIs alongside means.</w:t>
       </w:r>
     </w:p>
     <w:p>
@@ -4722,7 +5210,23 @@
         <w:pStyle w:val="ListBullet"/>
       </w:pPr>
       <w:r>
-        <w:t>Static CRC guarantee needs exchangeability — chronological splitting prevents leakage but does not provide it.</w:t>
+        <w:t>The 55/15/15/15% block-level split yields 37.8/22.6/13.7/25.8% at the sample level due to variable block lengths. This is by design (prevents leakage) but means the training set is smaller than a naive 55% sample split would suggest.</w:t>
+      </w:r>
+    </w:p>
+    <w:p>
+      <w:pPr>
+        <w:pStyle w:val="ListBullet"/>
+      </w:pPr>
+      <w:r>
+        <w:t>Static CRC formal guarantee requires exchangeability. Chronological trajectory-block splitting prevents leakage but does not establish exchangeability between calibration and test trajectories.</w:t>
+      </w:r>
+    </w:p>
+    <w:p>
+      <w:pPr>
+        <w:pStyle w:val="ListBullet"/>
+      </w:pPr>
+      <w:r>
+        <w:t>References [2],[8],[9],[10] use author names from the original research survey. Exact citations should be verified against Google Scholar before final submission.</w:t>
       </w:r>
     </w:p>
     <w:p>
@@ -4739,7 +5243,7 @@
         <w:pStyle w:val="ListBullet"/>
       </w:pPr>
       <w:r>
-        <w:t>Scale to Scenarios 36–39 for more test blocks and tighter CIs.</w:t>
+        <w:t>Scale to Scenarios 36–39 for more trajectory blocks, tighter CIs, and stronger generalization claims.</w:t>
       </w:r>
     </w:p>
     <w:p>
@@ -4755,7 +5259,7 @@
         <w:pStyle w:val="ListBullet"/>
       </w:pPr>
       <w:r>
-        <w:t>Weighted CRC under covariate shift for formal coverage guarantees under distribution change.</w:t>
+        <w:t>Weighted CRC under covariate shift for formal coverage guarantees when test distribution differs from calibration.</w:t>
       </w:r>
     </w:p>
     <w:p>
@@ -4763,7 +5267,7 @@
         <w:pStyle w:val="ListBullet"/>
       </w:pPr>
       <w:r>
-        <w:t>Missing modality robustness with masking strategies.</w:t>
+        <w:t>Missing modality robustness: masking strategies for GPS degradation or camera occlusion.</w:t>
       </w:r>
     </w:p>
     <w:p>
@@ -4771,7 +5275,7 @@
         <w:pStyle w:val="ListBullet"/>
       </w:pPr>
       <w:r>
-        <w:t>Low-dimensional profile parameterization (peak angle + basis coefficients).</w:t>
+        <w:t>Low-dimensional profile parameterization (peak angle + basis coefficients) to reduce overfitting on rare beams.</w:t>
       </w:r>
     </w:p>
     <w:p>
@@ -4779,7 +5283,7 @@
         <w:pStyle w:val="ListBullet"/>
       </w:pPr>
       <w:r>
-        <w:t>End-to-end spectral efficiency metric accounting for inference latency and probing overhead.</w:t>
+        <w:t>End-to-end spectral efficiency metric accounting for inference latency and probing overhead (RQ4).</w:t>
       </w:r>
     </w:p>
     <w:p/>
@@ -4794,6 +5298,19 @@
     </w:p>
     <w:p>
       <w:pPr>
+        <w:ind w:left="288"/>
+      </w:pPr>
+      <w:r>
+        <w:rPr>
+          <w:i/>
+          <w:sz w:val="18"/>
+        </w:rPr>
+        <w:t>Note: * = author names unverified at time of writing. Please confirm against Google Scholar before final submission.</w:t>
+      </w:r>
+    </w:p>
+    <w:p/>
+    <w:p>
+      <w:pPr>
         <w:spacing w:after="80"/>
         <w:ind w:left="432" w:hanging="432"/>
       </w:pPr>
@@ -4807,7 +5324,7 @@
         <w:ind w:left="432" w:hanging="432"/>
       </w:pPr>
       <w:r>
-        <w:t>[2] H. Jiang et al., "Multimodal Transformers for Wireless Communications: A Case Study in Beam Prediction," IEEE Trans. Wireless Commun., 2023.</w:t>
+        <w:t>[2] H. Jiang et al.*, "Multimodal Transformers for Wireless Communications: A Case Study in Beam Prediction," IEEE Trans. Wireless Commun., 2023.</w:t>
       </w:r>
     </w:p>
     <w:p>
@@ -4825,7 +5342,7 @@
         <w:ind w:left="432" w:hanging="432"/>
       </w:pPr>
       <w:r>
-        <w:t>[4] I. Gibbs and E. Candès, "Adaptive Conformal Inference Under Distribution Shift," NeurIPS, 2021.</w:t>
+        <w:t>[4] I. Gibbs and E. Candès, "Adaptive Conformal Inference Under Distribution Shift," in Proc. NeurIPS, 2021.</w:t>
       </w:r>
     </w:p>
     <w:p>
@@ -4834,7 +5351,7 @@
         <w:ind w:left="432" w:hanging="432"/>
       </w:pPr>
       <w:r>
-        <w:t>[5] A. N. Angelopoulos, E. J. Candès, and R. J. Tibshirani, "Conformal PID Control for Time Series Prediction," NeurIPS, 2023.</w:t>
+        <w:t>[5] A. N. Angelopoulos, E. J. Candès, and R. J. Tibshirani, "Conformal PID Control for Time Series Prediction," in Proc. NeurIPS, 2023.</w:t>
       </w:r>
     </w:p>
     <w:p>
@@ -4861,7 +5378,7 @@
         <w:ind w:left="432" w:hanging="432"/>
       </w:pPr>
       <w:r>
-        <w:t>[8] H. Salehi et al., "Sensing-Assisted Adaptive Beam Probing With Calibrated Multimodal Priors," IEEE Wireless Commun. Lett., 2026.</w:t>
+        <w:t>[8] H. Salehi et al.*, "Sensing-Assisted Adaptive Beam Probing With Calibrated Multimodal Priors and Uncertainty-Aware Scheduling," IEEE Wireless Commun. Lett., 2026.</w:t>
       </w:r>
     </w:p>
     <w:p>
@@ -4870,7 +5387,7 @@
         <w:ind w:left="432" w:hanging="432"/>
       </w:pPr>
       <w:r>
-        <w:t>[9] Y. Zhang et al., "Lightweight Vision-Aided Beam Tracking for Cross-Environment mmWave Communications," arXiv, 2026.</w:t>
+        <w:t>[9] Y. Zhang et al.*, "Lightweight Vision-Aided Beam Tracking for Cross-Environment mmWave Communications," arXiv, 2026.</w:t>
       </w:r>
     </w:p>
     <w:p>
@@ -4879,7 +5396,7 @@
         <w:ind w:left="432" w:hanging="432"/>
       </w:pPr>
       <w:r>
-        <w:t>[10] J. Chen et al., "Multi-Task Learning for mmWave Transceiver Beam Prediction," IEEE Open J. Commun. Soc., 2025.</w:t>
+        <w:t>[10] J. Chen et al.*, "Multi-Task Learning for mmWave Transceiver Beam Prediction," IEEE Open J. Commun. Soc., 2025.</w:t>
       </w:r>
     </w:p>
     <w:sectPr>

</xml_diff>